<commit_message>
docs: red-team pass on paper claims + book TOC pagination
Tighten PAPER.ko.md overclaiming flagged in review: mark section 6 as
a single-machine N=1 case study, disclose the corpus is private, note
the 7.2 subsumption relation was synthetic (not schema v1), and explain
why the ontology adapter uses a 66-triple excerpt instead of the full
schema (label-shadowing from duplicate Korean labels). Add the excerpt
itself (examples/mission_command_intent_core.ttl) so the paper's claims
are reproducible from the repo.

Give build_book.py real page numbers in the contents page via a two-pass
build (scripts/measure_toc_pages.ps1 measures via Word COM), plus italic
markdown support and repeating table headers. Fix README/ARCHITECTURE
missing the ingest/align commands and stale MUSA-AI repo URLs. Rebuild
the docx and regenerate the seven figures to match.
</commit_message>
<xml_diff>
--- a/docs/MAIOS_책_v1.docx
+++ b/docs/MAIOS_책_v1.docx
@@ -259,6 +259,9 @@
     </w:p>
     <w:p>
       <w:pPr>
+        <w:tabs>
+          <w:tab w:pos="6463" w:val="right" w:leader="dot"/>
+        </w:tabs>
         <w:spacing w:after="80" w:line="360" w:lineRule="auto"/>
       </w:pPr>
       <w:r>
@@ -269,78 +272,21 @@
         </w:rPr>
         <w:t>머리말</w:t>
       </w:r>
-    </w:p>
-    <w:p>
-      <w:pPr>
-        <w:spacing w:after="80" w:line="360" w:lineRule="auto"/>
-      </w:pPr>
       <w:r>
         <w:rPr>
           <w:rFonts w:ascii="맑은 고딕" w:hAnsi="맑은 고딕" w:eastAsia="맑은 고딕"/>
           <w:b/>
           <w:sz w:val="23"/>
         </w:rPr>
-        <w:t>제1부  사용 안내</w:t>
-      </w:r>
-    </w:p>
-    <w:p>
-      <w:pPr>
-        <w:spacing w:after="80" w:line="360" w:lineRule="auto"/>
-        <w:ind w:left="283"/>
-      </w:pPr>
-      <w:r>
-        <w:rPr>
-          <w:rFonts w:ascii="바탕" w:hAnsi="바탕" w:eastAsia="바탕"/>
-          <w:b w:val="0"/>
-          <w:sz w:val="21"/>
-        </w:rPr>
-        <w:t>MAIOS란 무엇인가 / 설치 / 5분 훑어보기</w:t>
-      </w:r>
-    </w:p>
-    <w:p>
-      <w:pPr>
-        <w:spacing w:after="80" w:line="360" w:lineRule="auto"/>
-        <w:ind w:left="283"/>
-      </w:pPr>
-      <w:r>
-        <w:rPr>
-          <w:rFonts w:ascii="바탕" w:hAnsi="바탕" w:eastAsia="바탕"/>
-          <w:b w:val="0"/>
-          <w:sz w:val="21"/>
-        </w:rPr>
-        <w:t>명령어 상세 (pursue · project · research · ingest · align · shell)</w:t>
-      </w:r>
-    </w:p>
-    <w:p>
-      <w:pPr>
-        <w:spacing w:after="80" w:line="360" w:lineRule="auto"/>
-        <w:ind w:left="283"/>
-      </w:pPr>
-      <w:r>
-        <w:rPr>
-          <w:rFonts w:ascii="바탕" w:hAnsi="바탕" w:eastAsia="바탕"/>
-          <w:b w:val="0"/>
-          <w:sz w:val="21"/>
-        </w:rPr>
-        <w:t>워크스페이스 / 거버넌스 / 실전 워크플로우</w:t>
-      </w:r>
-    </w:p>
-    <w:p>
-      <w:pPr>
-        <w:spacing w:after="80" w:line="360" w:lineRule="auto"/>
-        <w:ind w:left="283"/>
-      </w:pPr>
-      <w:r>
-        <w:rPr>
-          <w:rFonts w:ascii="바탕" w:hAnsi="바탕" w:eastAsia="바탕"/>
-          <w:b w:val="0"/>
-          <w:sz w:val="21"/>
-        </w:rPr>
-        <w:t>파이썬 API / 문제 해결 / FAQ</w:t>
-      </w:r>
-    </w:p>
-    <w:p>
-      <w:pPr>
+        <w:tab/>
+        <w:t>3</w:t>
+      </w:r>
+    </w:p>
+    <w:p>
+      <w:pPr>
+        <w:tabs>
+          <w:tab w:pos="6463" w:val="right" w:leader="dot"/>
+        </w:tabs>
         <w:spacing w:after="80" w:line="360" w:lineRule="auto"/>
       </w:pPr>
       <w:r>
@@ -349,76 +295,274 @@
           <w:b/>
           <w:sz w:val="23"/>
         </w:rPr>
-        <w:t>제2부  설계와 실증 (연구논문)</w:t>
-      </w:r>
-    </w:p>
-    <w:p>
-      <w:pPr>
-        <w:spacing w:after="80" w:line="360" w:lineRule="auto"/>
-        <w:ind w:left="283"/>
-      </w:pPr>
-      <w:r>
-        <w:rPr>
-          <w:rFonts w:ascii="바탕" w:hAnsi="바탕" w:eastAsia="바탕"/>
-          <w:b w:val="0"/>
-          <w:sz w:val="21"/>
-        </w:rPr>
-        <w:t>서론 / 관련 연구 / 설계 원칙 / 아키텍처</w:t>
-      </w:r>
-    </w:p>
-    <w:p>
-      <w:pPr>
-        <w:spacing w:after="80" w:line="360" w:lineRule="auto"/>
-        <w:ind w:left="283"/>
-      </w:pPr>
-      <w:r>
-        <w:rPr>
-          <w:rFonts w:ascii="바탕" w:hAnsi="바탕" w:eastAsia="바탕"/>
-          <w:b w:val="0"/>
-          <w:sz w:val="21"/>
-        </w:rPr>
-        <w:t>구현과 검증 방법론 / 실사용 코퍼스 사례연구</w:t>
-      </w:r>
-    </w:p>
-    <w:p>
-      <w:pPr>
-        <w:spacing w:after="80" w:line="360" w:lineRule="auto"/>
-        <w:ind w:left="283"/>
-      </w:pPr>
-      <w:r>
-        <w:rPr>
-          <w:rFonts w:ascii="바탕" w:hAnsi="바탕" w:eastAsia="바탕"/>
-          <w:b w:val="0"/>
-          <w:sz w:val="21"/>
-        </w:rPr>
-        <w:t>온톨로지 결합과 임무형지휘의 소프트웨어적 번역</w:t>
-      </w:r>
-    </w:p>
-    <w:p>
-      <w:pPr>
-        <w:spacing w:after="80" w:line="360" w:lineRule="auto"/>
-        <w:ind w:left="283"/>
-      </w:pPr>
-      <w:r>
-        <w:rPr>
-          <w:rFonts w:ascii="바탕" w:hAnsi="바탕" w:eastAsia="바탕"/>
-          <w:b w:val="0"/>
-          <w:sz w:val="21"/>
-        </w:rPr>
-        <w:t>한계와 향후 과제 / 결론 / 참고문헌</w:t>
-      </w:r>
-    </w:p>
-    <w:p>
-      <w:pPr>
-        <w:spacing w:after="80" w:line="360" w:lineRule="auto"/>
-      </w:pPr>
+        <w:t>제1부  사용 안내</w:t>
+      </w:r>
       <w:r>
         <w:rPr>
           <w:rFonts w:ascii="맑은 고딕" w:hAnsi="맑은 고딕" w:eastAsia="맑은 고딕"/>
           <w:b/>
           <w:sz w:val="23"/>
         </w:rPr>
+        <w:tab/>
+        <w:t>5</w:t>
+      </w:r>
+    </w:p>
+    <w:p>
+      <w:pPr>
+        <w:tabs>
+          <w:tab w:pos="6463" w:val="right" w:leader="dot"/>
+        </w:tabs>
+        <w:spacing w:after="80" w:line="360" w:lineRule="auto"/>
+        <w:ind w:left="283"/>
+      </w:pPr>
+      <w:r>
+        <w:rPr>
+          <w:rFonts w:ascii="바탕" w:hAnsi="바탕" w:eastAsia="바탕"/>
+          <w:b w:val="0"/>
+          <w:sz w:val="21"/>
+        </w:rPr>
+        <w:t>MAIOS란 무엇인가 / 설치 / 5분 훑어보기</w:t>
+      </w:r>
+      <w:r>
+        <w:rPr>
+          <w:rFonts w:ascii="바탕" w:hAnsi="바탕" w:eastAsia="바탕"/>
+          <w:b w:val="0"/>
+          <w:sz w:val="21"/>
+        </w:rPr>
+        <w:tab/>
+        <w:t>6</w:t>
+      </w:r>
+    </w:p>
+    <w:p>
+      <w:pPr>
+        <w:tabs>
+          <w:tab w:pos="6463" w:val="right" w:leader="dot"/>
+        </w:tabs>
+        <w:spacing w:after="80" w:line="360" w:lineRule="auto"/>
+        <w:ind w:left="283"/>
+      </w:pPr>
+      <w:r>
+        <w:rPr>
+          <w:rFonts w:ascii="바탕" w:hAnsi="바탕" w:eastAsia="바탕"/>
+          <w:b w:val="0"/>
+          <w:sz w:val="21"/>
+        </w:rPr>
+        <w:t>명령어 상세 (pursue · project · research · ingest · align · shell)</w:t>
+      </w:r>
+      <w:r>
+        <w:rPr>
+          <w:rFonts w:ascii="바탕" w:hAnsi="바탕" w:eastAsia="바탕"/>
+          <w:b w:val="0"/>
+          <w:sz w:val="21"/>
+        </w:rPr>
+        <w:tab/>
+        <w:t>8</w:t>
+      </w:r>
+    </w:p>
+    <w:p>
+      <w:pPr>
+        <w:tabs>
+          <w:tab w:pos="6463" w:val="right" w:leader="dot"/>
+        </w:tabs>
+        <w:spacing w:after="80" w:line="360" w:lineRule="auto"/>
+        <w:ind w:left="283"/>
+      </w:pPr>
+      <w:r>
+        <w:rPr>
+          <w:rFonts w:ascii="바탕" w:hAnsi="바탕" w:eastAsia="바탕"/>
+          <w:b w:val="0"/>
+          <w:sz w:val="21"/>
+        </w:rPr>
+        <w:t>워크스페이스 / 거버넌스 / 실전 워크플로우</w:t>
+      </w:r>
+      <w:r>
+        <w:rPr>
+          <w:rFonts w:ascii="바탕" w:hAnsi="바탕" w:eastAsia="바탕"/>
+          <w:b w:val="0"/>
+          <w:sz w:val="21"/>
+        </w:rPr>
+        <w:tab/>
+        <w:t>13</w:t>
+      </w:r>
+    </w:p>
+    <w:p>
+      <w:pPr>
+        <w:tabs>
+          <w:tab w:pos="6463" w:val="right" w:leader="dot"/>
+        </w:tabs>
+        <w:spacing w:after="80" w:line="360" w:lineRule="auto"/>
+        <w:ind w:left="283"/>
+      </w:pPr>
+      <w:r>
+        <w:rPr>
+          <w:rFonts w:ascii="바탕" w:hAnsi="바탕" w:eastAsia="바탕"/>
+          <w:b w:val="0"/>
+          <w:sz w:val="21"/>
+        </w:rPr>
+        <w:t>파이썬 API / 문제 해결 / FAQ</w:t>
+      </w:r>
+      <w:r>
+        <w:rPr>
+          <w:rFonts w:ascii="바탕" w:hAnsi="바탕" w:eastAsia="바탕"/>
+          <w:b w:val="0"/>
+          <w:sz w:val="21"/>
+        </w:rPr>
+        <w:tab/>
+        <w:t>15</w:t>
+      </w:r>
+    </w:p>
+    <w:p>
+      <w:pPr>
+        <w:tabs>
+          <w:tab w:pos="6463" w:val="right" w:leader="dot"/>
+        </w:tabs>
+        <w:spacing w:after="80" w:line="360" w:lineRule="auto"/>
+      </w:pPr>
+      <w:r>
+        <w:rPr>
+          <w:rFonts w:ascii="맑은 고딕" w:hAnsi="맑은 고딕" w:eastAsia="맑은 고딕"/>
+          <w:b/>
+          <w:sz w:val="23"/>
+        </w:rPr>
+        <w:t>제2부  설계와 실증 (연구논문)</w:t>
+      </w:r>
+      <w:r>
+        <w:rPr>
+          <w:rFonts w:ascii="맑은 고딕" w:hAnsi="맑은 고딕" w:eastAsia="맑은 고딕"/>
+          <w:b/>
+          <w:sz w:val="23"/>
+        </w:rPr>
+        <w:tab/>
+        <w:t>18</w:t>
+      </w:r>
+    </w:p>
+    <w:p>
+      <w:pPr>
+        <w:tabs>
+          <w:tab w:pos="6463" w:val="right" w:leader="dot"/>
+        </w:tabs>
+        <w:spacing w:after="80" w:line="360" w:lineRule="auto"/>
+        <w:ind w:left="283"/>
+      </w:pPr>
+      <w:r>
+        <w:rPr>
+          <w:rFonts w:ascii="바탕" w:hAnsi="바탕" w:eastAsia="바탕"/>
+          <w:b w:val="0"/>
+          <w:sz w:val="21"/>
+        </w:rPr>
+        <w:t>서론 / 관련 연구 / 설계 원칙 / 아키텍처</w:t>
+      </w:r>
+      <w:r>
+        <w:rPr>
+          <w:rFonts w:ascii="바탕" w:hAnsi="바탕" w:eastAsia="바탕"/>
+          <w:b w:val="0"/>
+          <w:sz w:val="21"/>
+        </w:rPr>
+        <w:tab/>
+        <w:t>20</w:t>
+      </w:r>
+    </w:p>
+    <w:p>
+      <w:pPr>
+        <w:tabs>
+          <w:tab w:pos="6463" w:val="right" w:leader="dot"/>
+        </w:tabs>
+        <w:spacing w:after="80" w:line="360" w:lineRule="auto"/>
+        <w:ind w:left="283"/>
+      </w:pPr>
+      <w:r>
+        <w:rPr>
+          <w:rFonts w:ascii="바탕" w:hAnsi="바탕" w:eastAsia="바탕"/>
+          <w:b w:val="0"/>
+          <w:sz w:val="21"/>
+        </w:rPr>
+        <w:t>구현과 검증 방법론 / 실사용 코퍼스 사례연구</w:t>
+      </w:r>
+      <w:r>
+        <w:rPr>
+          <w:rFonts w:ascii="바탕" w:hAnsi="바탕" w:eastAsia="바탕"/>
+          <w:b w:val="0"/>
+          <w:sz w:val="21"/>
+        </w:rPr>
+        <w:tab/>
+        <w:t>26</w:t>
+      </w:r>
+    </w:p>
+    <w:p>
+      <w:pPr>
+        <w:tabs>
+          <w:tab w:pos="6463" w:val="right" w:leader="dot"/>
+        </w:tabs>
+        <w:spacing w:after="80" w:line="360" w:lineRule="auto"/>
+        <w:ind w:left="283"/>
+      </w:pPr>
+      <w:r>
+        <w:rPr>
+          <w:rFonts w:ascii="바탕" w:hAnsi="바탕" w:eastAsia="바탕"/>
+          <w:b w:val="0"/>
+          <w:sz w:val="21"/>
+        </w:rPr>
+        <w:t>온톨로지 결합과 임무형지휘의 소프트웨어적 번역</w:t>
+      </w:r>
+      <w:r>
+        <w:rPr>
+          <w:rFonts w:ascii="바탕" w:hAnsi="바탕" w:eastAsia="바탕"/>
+          <w:b w:val="0"/>
+          <w:sz w:val="21"/>
+        </w:rPr>
+        <w:tab/>
+        <w:t>31</w:t>
+      </w:r>
+    </w:p>
+    <w:p>
+      <w:pPr>
+        <w:tabs>
+          <w:tab w:pos="6463" w:val="right" w:leader="dot"/>
+        </w:tabs>
+        <w:spacing w:after="80" w:line="360" w:lineRule="auto"/>
+        <w:ind w:left="283"/>
+      </w:pPr>
+      <w:r>
+        <w:rPr>
+          <w:rFonts w:ascii="바탕" w:hAnsi="바탕" w:eastAsia="바탕"/>
+          <w:b w:val="0"/>
+          <w:sz w:val="21"/>
+        </w:rPr>
+        <w:t>한계와 향후 과제 / 결론 / 참고문헌</w:t>
+      </w:r>
+      <w:r>
+        <w:rPr>
+          <w:rFonts w:ascii="바탕" w:hAnsi="바탕" w:eastAsia="바탕"/>
+          <w:b w:val="0"/>
+          <w:sz w:val="21"/>
+        </w:rPr>
+        <w:tab/>
+        <w:t>35</w:t>
+      </w:r>
+    </w:p>
+    <w:p>
+      <w:pPr>
+        <w:tabs>
+          <w:tab w:pos="6463" w:val="right" w:leader="dot"/>
+        </w:tabs>
+        <w:spacing w:after="80" w:line="360" w:lineRule="auto"/>
+      </w:pPr>
+      <w:r>
+        <w:rPr>
+          <w:rFonts w:ascii="맑은 고딕" w:hAnsi="맑은 고딕" w:eastAsia="맑은 고딕"/>
+          <w:b/>
+          <w:sz w:val="23"/>
+        </w:rPr>
         <w:t>부록  산출물과 개발 이력</w:t>
+      </w:r>
+      <w:r>
+        <w:rPr>
+          <w:rFonts w:ascii="맑은 고딕" w:hAnsi="맑은 고딕" w:eastAsia="맑은 고딕"/>
+          <w:b/>
+          <w:sz w:val="23"/>
+        </w:rPr>
+        <w:tab/>
+        <w:t>39</w:t>
       </w:r>
     </w:p>
     <w:p>
@@ -731,6 +875,10 @@
         <w:gridCol w:w="3231"/>
       </w:tblGrid>
       <w:tr>
+        <w:trPr>
+          <w:cantSplit/>
+          <w:tblHeader/>
+        </w:trPr>
         <w:tc>
           <w:tcPr>
             <w:tcW w:type="dxa" w:w="3231"/>
@@ -763,6 +911,9 @@
         </w:tc>
       </w:tr>
       <w:tr>
+        <w:trPr>
+          <w:cantSplit/>
+        </w:trPr>
         <w:tc>
           <w:tcPr>
             <w:tcW w:type="dxa" w:w="3231"/>
@@ -795,6 +946,9 @@
         </w:tc>
       </w:tr>
       <w:tr>
+        <w:trPr>
+          <w:cantSplit/>
+        </w:trPr>
         <w:tc>
           <w:tcPr>
             <w:tcW w:type="dxa" w:w="3231"/>
@@ -835,6 +989,9 @@
         </w:tc>
       </w:tr>
       <w:tr>
+        <w:trPr>
+          <w:cantSplit/>
+        </w:trPr>
         <w:tc>
           <w:tcPr>
             <w:tcW w:type="dxa" w:w="3231"/>
@@ -909,7 +1066,7 @@
           <w:rFonts w:ascii="Consolas" w:hAnsi="Consolas" w:eastAsia="Consolas"/>
           <w:b w:val="0"/>
           <w:color w:val="52514E"/>
-          <w:sz w:val="17"/>
+          <w:sz w:val="16"/>
         </w:rPr>
         <w:t>git clone https://github.com/yhkwon6454-boop/MAIOS.git</w:t>
       </w:r>
@@ -924,7 +1081,7 @@
           <w:rFonts w:ascii="Consolas" w:hAnsi="Consolas" w:eastAsia="Consolas"/>
           <w:b w:val="0"/>
           <w:color w:val="52514E"/>
-          <w:sz w:val="17"/>
+          <w:sz w:val="16"/>
         </w:rPr>
         <w:t>cd MAIOS</w:t>
       </w:r>
@@ -939,7 +1096,7 @@
           <w:rFonts w:ascii="Consolas" w:hAnsi="Consolas" w:eastAsia="Consolas"/>
           <w:b w:val="0"/>
           <w:color w:val="52514E"/>
-          <w:sz w:val="17"/>
+          <w:sz w:val="16"/>
         </w:rPr>
         <w:t>python -m venv .venv</w:t>
       </w:r>
@@ -954,7 +1111,7 @@
           <w:rFonts w:ascii="Consolas" w:hAnsi="Consolas" w:eastAsia="Consolas"/>
           <w:b w:val="0"/>
           <w:color w:val="52514E"/>
-          <w:sz w:val="17"/>
+          <w:sz w:val="16"/>
         </w:rPr>
         <w:t xml:space="preserve"> </w:t>
       </w:r>
@@ -969,7 +1126,7 @@
           <w:rFonts w:ascii="Consolas" w:hAnsi="Consolas" w:eastAsia="Consolas"/>
           <w:b w:val="0"/>
           <w:color w:val="52514E"/>
-          <w:sz w:val="17"/>
+          <w:sz w:val="16"/>
         </w:rPr>
         <w:t># Windows</w:t>
       </w:r>
@@ -984,7 +1141,7 @@
           <w:rFonts w:ascii="Consolas" w:hAnsi="Consolas" w:eastAsia="Consolas"/>
           <w:b w:val="0"/>
           <w:color w:val="52514E"/>
-          <w:sz w:val="17"/>
+          <w:sz w:val="16"/>
         </w:rPr>
         <w:t>.\.venv\Scripts\python.exe -m pip install -e .[dev]</w:t>
       </w:r>
@@ -999,7 +1156,7 @@
           <w:rFonts w:ascii="Consolas" w:hAnsi="Consolas" w:eastAsia="Consolas"/>
           <w:b w:val="0"/>
           <w:color w:val="52514E"/>
-          <w:sz w:val="17"/>
+          <w:sz w:val="16"/>
         </w:rPr>
         <w:t># macOS/Linux</w:t>
       </w:r>
@@ -1014,7 +1171,7 @@
           <w:rFonts w:ascii="Consolas" w:hAnsi="Consolas" w:eastAsia="Consolas"/>
           <w:b w:val="0"/>
           <w:color w:val="52514E"/>
-          <w:sz w:val="17"/>
+          <w:sz w:val="16"/>
         </w:rPr>
         <w:t>.venv/bin/python -m pip install -e .[dev]</w:t>
       </w:r>
@@ -1042,7 +1199,7 @@
           <w:rFonts w:ascii="Consolas" w:hAnsi="Consolas" w:eastAsia="Consolas"/>
           <w:b w:val="0"/>
           <w:color w:val="52514E"/>
-          <w:sz w:val="17"/>
+          <w:sz w:val="16"/>
         </w:rPr>
         <w:t>maios --version        # 1.3.0</w:t>
       </w:r>
@@ -1108,7 +1265,7 @@
           <w:rFonts w:ascii="Consolas" w:hAnsi="Consolas" w:eastAsia="Consolas"/>
           <w:b w:val="0"/>
           <w:color w:val="52514E"/>
-          <w:sz w:val="17"/>
+          <w:sz w:val="16"/>
         </w:rPr>
         <w:t>ANTHROPIC_API_KEY=sk-ant-...     # Claude</w:t>
       </w:r>
@@ -1123,7 +1280,7 @@
           <w:rFonts w:ascii="Consolas" w:hAnsi="Consolas" w:eastAsia="Consolas"/>
           <w:b w:val="0"/>
           <w:color w:val="52514E"/>
-          <w:sz w:val="17"/>
+          <w:sz w:val="16"/>
         </w:rPr>
         <w:t>OPENAI_API_KEY=sk-...            # GPT</w:t>
       </w:r>
@@ -1138,7 +1295,7 @@
           <w:rFonts w:ascii="Consolas" w:hAnsi="Consolas" w:eastAsia="Consolas"/>
           <w:b w:val="0"/>
           <w:color w:val="52514E"/>
-          <w:sz w:val="17"/>
+          <w:sz w:val="16"/>
         </w:rPr>
         <w:t>GEMINI_API_KEY=...               # Gemini</w:t>
       </w:r>
@@ -1196,7 +1353,7 @@
           <w:rFonts w:ascii="Consolas" w:hAnsi="Consolas" w:eastAsia="Consolas"/>
           <w:b w:val="0"/>
           <w:color w:val="52514E"/>
-          <w:sz w:val="17"/>
+          <w:sz w:val="16"/>
         </w:rPr>
         <w:t># 1) 목표 하나 수행 (거버넌스 → 인지 루프 → 교훈 축적)</w:t>
       </w:r>
@@ -1211,7 +1368,7 @@
           <w:rFonts w:ascii="Consolas" w:hAnsi="Consolas" w:eastAsia="Consolas"/>
           <w:b w:val="0"/>
           <w:color w:val="52514E"/>
-          <w:sz w:val="17"/>
+          <w:sz w:val="16"/>
         </w:rPr>
         <w:t>maios pursue "주간 보고서를 세 문장으로 요약"  --llm claude</w:t>
       </w:r>
@@ -1226,7 +1383,7 @@
           <w:rFonts w:ascii="Consolas" w:hAnsi="Consolas" w:eastAsia="Consolas"/>
           <w:b w:val="0"/>
           <w:color w:val="52514E"/>
-          <w:sz w:val="17"/>
+          <w:sz w:val="16"/>
         </w:rPr>
         <w:t xml:space="preserve"> </w:t>
       </w:r>
@@ -1241,7 +1398,7 @@
           <w:rFonts w:ascii="Consolas" w:hAnsi="Consolas" w:eastAsia="Consolas"/>
           <w:b w:val="0"/>
           <w:color w:val="52514E"/>
-          <w:sz w:val="17"/>
+          <w:sz w:val="16"/>
         </w:rPr>
         <w:t># 2) 내 문서를 지식으로 흡수 (md/txt/html, 한글 인코딩 자동)</w:t>
       </w:r>
@@ -1256,7 +1413,7 @@
           <w:rFonts w:ascii="Consolas" w:hAnsi="Consolas" w:eastAsia="Consolas"/>
           <w:b w:val="0"/>
           <w:color w:val="52514E"/>
-          <w:sz w:val="17"/>
+          <w:sz w:val="16"/>
         </w:rPr>
         <w:t>maios ingest ~/내문서폴더</w:t>
       </w:r>
@@ -1271,7 +1428,7 @@
           <w:rFonts w:ascii="Consolas" w:hAnsi="Consolas" w:eastAsia="Consolas"/>
           <w:b w:val="0"/>
           <w:color w:val="52514E"/>
-          <w:sz w:val="17"/>
+          <w:sz w:val="16"/>
         </w:rPr>
         <w:t xml:space="preserve"> </w:t>
       </w:r>
@@ -1286,7 +1443,7 @@
           <w:rFonts w:ascii="Consolas" w:hAnsi="Consolas" w:eastAsia="Consolas"/>
           <w:b w:val="0"/>
           <w:color w:val="52514E"/>
-          <w:sz w:val="17"/>
+          <w:sz w:val="16"/>
         </w:rPr>
         <w:t># 3) 흡수한 지식 위에서 연구</w:t>
       </w:r>
@@ -1301,7 +1458,7 @@
           <w:rFonts w:ascii="Consolas" w:hAnsi="Consolas" w:eastAsia="Consolas"/>
           <w:b w:val="0"/>
           <w:color w:val="52514E"/>
-          <w:sz w:val="17"/>
+          <w:sz w:val="16"/>
         </w:rPr>
         <w:t>maios research "우리 문서에서 드론 방어의 핵심 교훈은?"</w:t>
       </w:r>
@@ -1316,7 +1473,7 @@
           <w:rFonts w:ascii="Consolas" w:hAnsi="Consolas" w:eastAsia="Consolas"/>
           <w:b w:val="0"/>
           <w:color w:val="52514E"/>
-          <w:sz w:val="17"/>
+          <w:sz w:val="16"/>
         </w:rPr>
         <w:t xml:space="preserve"> </w:t>
       </w:r>
@@ -1331,7 +1488,7 @@
           <w:rFonts w:ascii="Consolas" w:hAnsi="Consolas" w:eastAsia="Consolas"/>
           <w:b w:val="0"/>
           <w:color w:val="52514E"/>
-          <w:sz w:val="17"/>
+          <w:sz w:val="16"/>
         </w:rPr>
         <w:t># 4) 큰 목표를 하위 목표로 쪼개 순차 수행 후 종합</w:t>
       </w:r>
@@ -1346,7 +1503,7 @@
           <w:rFonts w:ascii="Consolas" w:hAnsi="Consolas" w:eastAsia="Consolas"/>
           <w:b w:val="0"/>
           <w:color w:val="52514E"/>
-          <w:sz w:val="17"/>
+          <w:sz w:val="16"/>
         </w:rPr>
         <w:t>maios project "드론 위협 분석 2부작 브리핑 작성" --llm claude</w:t>
       </w:r>
@@ -1361,7 +1518,7 @@
           <w:rFonts w:ascii="Consolas" w:hAnsi="Consolas" w:eastAsia="Consolas"/>
           <w:b w:val="0"/>
           <w:color w:val="52514E"/>
-          <w:sz w:val="17"/>
+          <w:sz w:val="16"/>
         </w:rPr>
         <w:t xml:space="preserve"> </w:t>
       </w:r>
@@ -1376,7 +1533,7 @@
           <w:rFonts w:ascii="Consolas" w:hAnsi="Consolas" w:eastAsia="Consolas"/>
           <w:b w:val="0"/>
           <w:color w:val="52514E"/>
-          <w:sz w:val="17"/>
+          <w:sz w:val="16"/>
         </w:rPr>
         <w:t># 5) 시스템 자기 점검</w:t>
       </w:r>
@@ -1391,7 +1548,7 @@
           <w:rFonts w:ascii="Consolas" w:hAnsi="Consolas" w:eastAsia="Consolas"/>
           <w:b w:val="0"/>
           <w:color w:val="52514E"/>
-          <w:sz w:val="17"/>
+          <w:sz w:val="16"/>
         </w:rPr>
         <w:t>maios introspect</w:t>
       </w:r>
@@ -1406,7 +1563,7 @@
           <w:rFonts w:ascii="Consolas" w:hAnsi="Consolas" w:eastAsia="Consolas"/>
           <w:b w:val="0"/>
           <w:color w:val="52514E"/>
-          <w:sz w:val="17"/>
+          <w:sz w:val="16"/>
         </w:rPr>
         <w:t xml:space="preserve"> </w:t>
       </w:r>
@@ -1421,7 +1578,7 @@
           <w:rFonts w:ascii="Consolas" w:hAnsi="Consolas" w:eastAsia="Consolas"/>
           <w:b w:val="0"/>
           <w:color w:val="52514E"/>
-          <w:sz w:val="17"/>
+          <w:sz w:val="16"/>
         </w:rPr>
         <w:t># 6) 대화형 세션 (가장 편한 사용법)</w:t>
       </w:r>
@@ -1436,7 +1593,7 @@
           <w:rFonts w:ascii="Consolas" w:hAnsi="Consolas" w:eastAsia="Consolas"/>
           <w:b w:val="0"/>
           <w:color w:val="52514E"/>
-          <w:sz w:val="17"/>
+          <w:sz w:val="16"/>
         </w:rPr>
         <w:t>maios shell --llm claude</w:t>
       </w:r>
@@ -1451,7 +1608,7 @@
           <w:b w:val="0"/>
           <w:sz w:val="21"/>
         </w:rPr>
-        <w:t xml:space="preserve">모든 명령 끝에 </w:t>
+        <w:t xml:space="preserve">대부분의 명령 끝에 </w:t>
       </w:r>
       <w:r>
         <w:rPr>
@@ -1459,7 +1616,7 @@
           <w:b w:val="0"/>
           <w:sz w:val="19"/>
         </w:rPr>
-        <w:t>[memory] nodes=N pursuits=M</w:t>
+        <w:t>[memory] nodes=N pursuits=M workspace=경로</w:t>
       </w:r>
       <w:r>
         <w:rPr>
@@ -1467,7 +1624,23 @@
           <w:b w:val="0"/>
           <w:sz w:val="21"/>
         </w:rPr>
-        <w:t>이 출력됩니다 — 기억이 쌓이는 것이 눈에 보입니다.</w:t>
+        <w:t>가 출력됩니다(</w:t>
+      </w:r>
+      <w:r>
+        <w:rPr>
+          <w:rFonts w:ascii="Consolas" w:hAnsi="Consolas" w:eastAsia="Consolas"/>
+          <w:b w:val="0"/>
+          <w:sz w:val="19"/>
+        </w:rPr>
+        <w:t>align</w:t>
+      </w:r>
+      <w:r>
+        <w:rPr>
+          <w:rFonts w:ascii="바탕" w:hAnsi="바탕" w:eastAsia="바탕"/>
+          <w:b w:val="0"/>
+          <w:sz w:val="21"/>
+        </w:rPr>
+        <w:t>·미션 파일 실행 제외) — 기억이 쌓이는 것이 눈에 보입니다.</w:t>
       </w:r>
     </w:p>
     <w:p>
@@ -1521,7 +1694,7 @@
           <w:rFonts w:ascii="Consolas" w:hAnsi="Consolas" w:eastAsia="Consolas"/>
           <w:b w:val="0"/>
           <w:color w:val="52514E"/>
-          <w:sz w:val="17"/>
+          <w:sz w:val="16"/>
         </w:rPr>
         <w:t>maios pursue "국방 AI 동향을 다섯 줄로 정리" --llm claude</w:t>
       </w:r>
@@ -1549,7 +1722,7 @@
           <w:rFonts w:ascii="Consolas" w:hAnsi="Consolas" w:eastAsia="Consolas"/>
           <w:b w:val="0"/>
           <w:color w:val="52514E"/>
-          <w:sz w:val="17"/>
+          <w:sz w:val="16"/>
         </w:rPr>
         <w:t>[MAIOS] objective: ...            목표</w:t>
       </w:r>
@@ -1564,7 +1737,7 @@
           <w:rFonts w:ascii="Consolas" w:hAnsi="Consolas" w:eastAsia="Consolas"/>
           <w:b w:val="0"/>
           <w:color w:val="52514E"/>
-          <w:sz w:val="17"/>
+          <w:sz w:val="16"/>
         </w:rPr>
         <w:t>[governance] risk=LOW approved=True   거버넌스 심사 결과</w:t>
       </w:r>
@@ -1579,7 +1752,7 @@
           <w:rFonts w:ascii="Consolas" w:hAnsi="Consolas" w:eastAsia="Consolas"/>
           <w:b w:val="0"/>
           <w:color w:val="52514E"/>
-          <w:sz w:val="17"/>
+          <w:sz w:val="16"/>
         </w:rPr>
         <w:t>[cycles] 1 executed               실행된 인지 사이클 수</w:t>
       </w:r>
@@ -1594,7 +1767,7 @@
           <w:rFonts w:ascii="Consolas" w:hAnsi="Consolas" w:eastAsia="Consolas"/>
           <w:b w:val="0"/>
           <w:color w:val="52514E"/>
-          <w:sz w:val="17"/>
+          <w:sz w:val="16"/>
         </w:rPr>
         <w:t xml:space="preserve">  cycle 1: COMPLETED (observe -&gt; understand -&gt; ... -&gt; learn)</w:t>
       </w:r>
@@ -1609,7 +1782,7 @@
           <w:rFonts w:ascii="Consolas" w:hAnsi="Consolas" w:eastAsia="Consolas"/>
           <w:b w:val="0"/>
           <w:color w:val="52514E"/>
-          <w:sz w:val="17"/>
+          <w:sz w:val="16"/>
         </w:rPr>
         <w:t xml:space="preserve">  [recall] ...                    과거 기억에서 회상한 항목</w:t>
       </w:r>
@@ -1624,7 +1797,7 @@
           <w:rFonts w:ascii="Consolas" w:hAnsi="Consolas" w:eastAsia="Consolas"/>
           <w:b w:val="0"/>
           <w:color w:val="52514E"/>
-          <w:sz w:val="17"/>
+          <w:sz w:val="16"/>
         </w:rPr>
         <w:t xml:space="preserve">  [understanding] ...             LLM의 상황 해석 (--llm 사용 시)</w:t>
       </w:r>
@@ -1639,7 +1812,7 @@
           <w:rFonts w:ascii="Consolas" w:hAnsi="Consolas" w:eastAsia="Consolas"/>
           <w:b w:val="0"/>
           <w:color w:val="52514E"/>
-          <w:sz w:val="17"/>
+          <w:sz w:val="16"/>
         </w:rPr>
         <w:t>[lessons]                         이번 수행에서 추출된 교훈</w:t>
       </w:r>
@@ -1654,7 +1827,7 @@
           <w:rFonts w:ascii="Consolas" w:hAnsi="Consolas" w:eastAsia="Consolas"/>
           <w:b w:val="0"/>
           <w:color w:val="52514E"/>
-          <w:sz w:val="17"/>
+          <w:sz w:val="16"/>
         </w:rPr>
         <w:t>[output] ...                      생성된 산출물 미리보기 (500자)</w:t>
       </w:r>
@@ -1669,9 +1842,9 @@
           <w:rFonts w:ascii="Consolas" w:hAnsi="Consolas" w:eastAsia="Consolas"/>
           <w:b w:val="0"/>
           <w:color w:val="52514E"/>
-          <w:sz w:val="17"/>
-        </w:rPr>
-        <w:t>[artifact] .maios\artifacts\GP-xxxx.md   산출물 전문 파일</w:t>
+          <w:sz w:val="16"/>
+        </w:rPr>
+        <w:t>[status] COMPLETED</w:t>
       </w:r>
     </w:p>
     <w:p>
@@ -1684,9 +1857,9 @@
           <w:rFonts w:ascii="Consolas" w:hAnsi="Consolas" w:eastAsia="Consolas"/>
           <w:b w:val="0"/>
           <w:color w:val="52514E"/>
-          <w:sz w:val="17"/>
-        </w:rPr>
-        <w:t>[status] COMPLETED</w:t>
+          <w:sz w:val="16"/>
+        </w:rPr>
+        <w:t>[artifact] .maios\artifacts\GP-xxxx.md   산출물 전문 파일</w:t>
       </w:r>
     </w:p>
     <w:p>
@@ -1699,7 +1872,7 @@
           <w:rFonts w:ascii="Consolas" w:hAnsi="Consolas" w:eastAsia="Consolas"/>
           <w:b w:val="0"/>
           <w:color w:val="52514E"/>
-          <w:sz w:val="17"/>
+          <w:sz w:val="16"/>
         </w:rPr>
         <w:t>[memory] nodes=15 pursuits=3      누적 기억 현황</w:t>
       </w:r>
@@ -1729,6 +1902,10 @@
         <w:gridCol w:w="3231"/>
       </w:tblGrid>
       <w:tr>
+        <w:trPr>
+          <w:cantSplit/>
+          <w:tblHeader/>
+        </w:trPr>
         <w:tc>
           <w:tcPr>
             <w:tcW w:type="dxa" w:w="3231"/>
@@ -1761,6 +1938,9 @@
         </w:tc>
       </w:tr>
       <w:tr>
+        <w:trPr>
+          <w:cantSplit/>
+        </w:trPr>
         <w:tc>
           <w:tcPr>
             <w:tcW w:type="dxa" w:w="3231"/>
@@ -1793,6 +1973,9 @@
         </w:tc>
       </w:tr>
       <w:tr>
+        <w:trPr>
+          <w:cantSplit/>
+        </w:trPr>
         <w:tc>
           <w:tcPr>
             <w:tcW w:type="dxa" w:w="3231"/>
@@ -1825,6 +2008,9 @@
         </w:tc>
       </w:tr>
       <w:tr>
+        <w:trPr>
+          <w:cantSplit/>
+        </w:trPr>
         <w:tc>
           <w:tcPr>
             <w:tcW w:type="dxa" w:w="3231"/>
@@ -1857,6 +2043,9 @@
         </w:tc>
       </w:tr>
       <w:tr>
+        <w:trPr>
+          <w:cantSplit/>
+        </w:trPr>
         <w:tc>
           <w:tcPr>
             <w:tcW w:type="dxa" w:w="3231"/>
@@ -1889,6 +2078,9 @@
         </w:tc>
       </w:tr>
       <w:tr>
+        <w:trPr>
+          <w:cantSplit/>
+        </w:trPr>
         <w:tc>
           <w:tcPr>
             <w:tcW w:type="dxa" w:w="3231"/>
@@ -1995,7 +2187,7 @@
           <w:rFonts w:ascii="Consolas" w:hAnsi="Consolas" w:eastAsia="Consolas"/>
           <w:b w:val="0"/>
           <w:color w:val="52514E"/>
-          <w:sz w:val="17"/>
+          <w:sz w:val="16"/>
         </w:rPr>
         <w:t>maios project "신간 서평 작성: 자료 조사 후 초안" --max-subgoals 4 --llm claude</w:t>
       </w:r>
@@ -2095,7 +2287,7 @@
           <w:rFonts w:ascii="Consolas" w:hAnsi="Consolas" w:eastAsia="Consolas"/>
           <w:b w:val="0"/>
           <w:color w:val="52514E"/>
-          <w:sz w:val="17"/>
+          <w:sz w:val="16"/>
         </w:rPr>
         <w:t>maios ingest ~/책원고</w:t>
       </w:r>
@@ -2110,7 +2302,7 @@
           <w:rFonts w:ascii="Consolas" w:hAnsi="Consolas" w:eastAsia="Consolas"/>
           <w:b w:val="0"/>
           <w:color w:val="52514E"/>
-          <w:sz w:val="17"/>
+          <w:sz w:val="16"/>
         </w:rPr>
         <w:t>maios research "원고 전체를 관통하는 핵심 주장은?"</w:t>
       </w:r>
@@ -2181,7 +2373,7 @@
           <w:rFonts w:ascii="Consolas" w:hAnsi="Consolas" w:eastAsia="Consolas"/>
           <w:b w:val="0"/>
           <w:color w:val="52514E"/>
-          <w:sz w:val="17"/>
+          <w:sz w:val="16"/>
         </w:rPr>
         <w:t>maios ingest 보고서.md 메모.txt          # 개별 파일</w:t>
       </w:r>
@@ -2196,7 +2388,7 @@
           <w:rFonts w:ascii="Consolas" w:hAnsi="Consolas" w:eastAsia="Consolas"/>
           <w:b w:val="0"/>
           <w:color w:val="52514E"/>
-          <w:sz w:val="17"/>
+          <w:sz w:val="16"/>
         </w:rPr>
         <w:t>maios ingest ~/문서폴더                   # 디렉터리 재귀</w:t>
       </w:r>
@@ -2388,7 +2580,7 @@
           <w:rFonts w:ascii="Consolas" w:hAnsi="Consolas" w:eastAsia="Consolas"/>
           <w:b w:val="0"/>
           <w:color w:val="52514E"/>
-          <w:sz w:val="17"/>
+          <w:sz w:val="16"/>
         </w:rPr>
         <w:t>$ maios introspect --llm claude</w:t>
       </w:r>
@@ -2403,9 +2595,9 @@
           <w:rFonts w:ascii="Consolas" w:hAnsi="Consolas" w:eastAsia="Consolas"/>
           <w:b w:val="0"/>
           <w:color w:val="52514E"/>
-          <w:sz w:val="17"/>
-        </w:rPr>
-        <w:t>[MAIOS] identity=maios version=1.3.0 readiness=0.64</w:t>
+          <w:sz w:val="16"/>
+        </w:rPr>
+        <w:t>[MAIOS] identity=maios version=1.3.0 readiness=0.67</w:t>
       </w:r>
     </w:p>
     <w:p>
@@ -2418,7 +2610,7 @@
           <w:rFonts w:ascii="Consolas" w:hAnsi="Consolas" w:eastAsia="Consolas"/>
           <w:b w:val="0"/>
           <w:color w:val="52514E"/>
-          <w:sz w:val="17"/>
+          <w:sz w:val="16"/>
         </w:rPr>
         <w:t>[available] cognitive_loop, executive_brain, governance, knowledge_graph, llm, ...</w:t>
       </w:r>
@@ -2433,7 +2625,7 @@
           <w:rFonts w:ascii="Consolas" w:hAnsi="Consolas" w:eastAsia="Consolas"/>
           <w:b w:val="0"/>
           <w:color w:val="52514E"/>
-          <w:sz w:val="17"/>
+          <w:sz w:val="16"/>
         </w:rPr>
         <w:t>[missing] distributed_runtime, negotiation, swarm, ...</w:t>
       </w:r>
@@ -2517,7 +2709,7 @@
           <w:rFonts w:ascii="Consolas" w:hAnsi="Consolas" w:eastAsia="Consolas"/>
           <w:b w:val="0"/>
           <w:color w:val="52514E"/>
-          <w:sz w:val="17"/>
+          <w:sz w:val="16"/>
         </w:rPr>
         <w:t>maios shell --llm claude</w:t>
       </w:r>
@@ -2532,7 +2724,7 @@
           <w:rFonts w:ascii="Consolas" w:hAnsi="Consolas" w:eastAsia="Consolas"/>
           <w:b w:val="0"/>
           <w:color w:val="52514E"/>
-          <w:sz w:val="17"/>
+          <w:sz w:val="16"/>
         </w:rPr>
         <w:t>maios&gt; 오늘 회의록 요약해줘              ← 일반 목표</w:t>
       </w:r>
@@ -2547,7 +2739,7 @@
           <w:rFonts w:ascii="Consolas" w:hAnsi="Consolas" w:eastAsia="Consolas"/>
           <w:b w:val="0"/>
           <w:color w:val="52514E"/>
-          <w:sz w:val="17"/>
+          <w:sz w:val="16"/>
         </w:rPr>
         <w:t>maios&gt; /ingest ~/회의록모음              ← 문서 흡수</w:t>
       </w:r>
@@ -2562,7 +2754,7 @@
           <w:rFonts w:ascii="Consolas" w:hAnsi="Consolas" w:eastAsia="Consolas"/>
           <w:b w:val="0"/>
           <w:color w:val="52514E"/>
-          <w:sz w:val="17"/>
+          <w:sz w:val="16"/>
         </w:rPr>
         <w:t>maios&gt; /research 최근 회의의 반복 쟁점은?  ← 연구</w:t>
       </w:r>
@@ -2577,7 +2769,7 @@
           <w:rFonts w:ascii="Consolas" w:hAnsi="Consolas" w:eastAsia="Consolas"/>
           <w:b w:val="0"/>
           <w:color w:val="52514E"/>
-          <w:sz w:val="17"/>
+          <w:sz w:val="16"/>
         </w:rPr>
         <w:t>maios&gt; /project 월간 보고서 초안 작성      ← 프로젝트</w:t>
       </w:r>
@@ -2592,7 +2784,7 @@
           <w:rFonts w:ascii="Consolas" w:hAnsi="Consolas" w:eastAsia="Consolas"/>
           <w:b w:val="0"/>
           <w:color w:val="52514E"/>
-          <w:sz w:val="17"/>
+          <w:sz w:val="16"/>
         </w:rPr>
         <w:t>maios&gt; /history                          ← 최근 수행 이력</w:t>
       </w:r>
@@ -2607,7 +2799,7 @@
           <w:rFonts w:ascii="Consolas" w:hAnsi="Consolas" w:eastAsia="Consolas"/>
           <w:b w:val="0"/>
           <w:color w:val="52514E"/>
-          <w:sz w:val="17"/>
+          <w:sz w:val="16"/>
         </w:rPr>
         <w:t>maios&gt; /introspect                       ← 자기 점검</w:t>
       </w:r>
@@ -2622,7 +2814,7 @@
           <w:rFonts w:ascii="Consolas" w:hAnsi="Consolas" w:eastAsia="Consolas"/>
           <w:b w:val="0"/>
           <w:color w:val="52514E"/>
-          <w:sz w:val="17"/>
+          <w:sz w:val="16"/>
         </w:rPr>
         <w:t>maios&gt; /evolve                           ← 누적 성공률·교훈 보고</w:t>
       </w:r>
@@ -2637,9 +2829,9 @@
           <w:rFonts w:ascii="Consolas" w:hAnsi="Consolas" w:eastAsia="Consolas"/>
           <w:b w:val="0"/>
           <w:color w:val="52514E"/>
-          <w:sz w:val="17"/>
-        </w:rPr>
-        <w:t>maios&gt; /approve                          ← 직전 고위험 목표 승인 재실행</w:t>
+          <w:sz w:val="16"/>
+        </w:rPr>
+        <w:t>maios&gt; /approve                          ← 마지막 수행 목표를 인간 승인으로 재실행 (차단 직후 바로 사용)</w:t>
       </w:r>
     </w:p>
     <w:p>
@@ -2652,7 +2844,7 @@
           <w:rFonts w:ascii="Consolas" w:hAnsi="Consolas" w:eastAsia="Consolas"/>
           <w:b w:val="0"/>
           <w:color w:val="52514E"/>
-          <w:sz w:val="17"/>
+          <w:sz w:val="16"/>
         </w:rPr>
         <w:t>maios&gt; /exit</w:t>
       </w:r>
@@ -2681,7 +2873,7 @@
           <w:rFonts w:ascii="Consolas" w:hAnsi="Consolas" w:eastAsia="Consolas"/>
           <w:b w:val="0"/>
           <w:color w:val="52514E"/>
-          <w:sz w:val="17"/>
+          <w:sz w:val="16"/>
         </w:rPr>
         <w:t>maios mission.yaml     # YAML 미션 파일 실행 (v1.0 런타임 파이프라인)</w:t>
       </w:r>
@@ -2739,7 +2931,7 @@
           <w:rFonts w:ascii="Consolas" w:hAnsi="Consolas" w:eastAsia="Consolas"/>
           <w:b w:val="0"/>
           <w:color w:val="52514E"/>
-          <w:sz w:val="17"/>
+          <w:sz w:val="16"/>
         </w:rPr>
         <w:t>pip install rdflib                        # 선택 의존성</w:t>
       </w:r>
@@ -2754,7 +2946,7 @@
           <w:rFonts w:ascii="Consolas" w:hAnsi="Consolas" w:eastAsia="Consolas"/>
           <w:b w:val="0"/>
           <w:color w:val="52514E"/>
-          <w:sz w:val="17"/>
+          <w:sz w:val="16"/>
         </w:rPr>
         <w:t>cp 나의온톨로지.ttl .maios/ontology.ttl    # 워크스페이스에 배치하면 자동 감지</w:t>
       </w:r>
@@ -2769,7 +2961,7 @@
           <w:rFonts w:ascii="Consolas" w:hAnsi="Consolas" w:eastAsia="Consolas"/>
           <w:b w:val="0"/>
           <w:color w:val="52514E"/>
-          <w:sz w:val="17"/>
+          <w:sz w:val="16"/>
         </w:rPr>
         <w:t>maios pursue "지휘관 의도 전파 실태 점검"</w:t>
       </w:r>
@@ -2784,7 +2976,7 @@
           <w:rFonts w:ascii="Consolas" w:hAnsi="Consolas" w:eastAsia="Consolas"/>
           <w:b w:val="0"/>
           <w:color w:val="52514E"/>
-          <w:sz w:val="17"/>
+          <w:sz w:val="16"/>
         </w:rPr>
         <w:t xml:space="preserve">  [ontology] 목적, 최종상태, 핵심과업, 제한사항, ...   ← 확장된 용어</w:t>
       </w:r>
@@ -2799,7 +2991,7 @@
           <w:rFonts w:ascii="Consolas" w:hAnsi="Consolas" w:eastAsia="Consolas"/>
           <w:b w:val="0"/>
           <w:color w:val="52514E"/>
-          <w:sz w:val="17"/>
+          <w:sz w:val="16"/>
         </w:rPr>
         <w:t xml:space="preserve">  [recall] 훈련메모.md: ... 최종상태를 서로 다르게 이해 ...</w:t>
       </w:r>
@@ -2864,7 +3056,7 @@
           <w:rFonts w:ascii="Consolas" w:hAnsi="Consolas" w:eastAsia="Consolas"/>
           <w:b w:val="0"/>
           <w:color w:val="52514E"/>
-          <w:sz w:val="17"/>
+          <w:sz w:val="16"/>
         </w:rPr>
         <w:t>{"ontology_risk_labels": ["제한사항", "수용가능위험"]}</w:t>
       </w:r>
@@ -2879,7 +3071,7 @@
           <w:rFonts w:ascii="Consolas" w:hAnsi="Consolas" w:eastAsia="Consolas"/>
           <w:b w:val="0"/>
           <w:color w:val="52514E"/>
-          <w:sz w:val="17"/>
+          <w:sz w:val="16"/>
         </w:rPr>
         <w:t>maios pursue "제한사항을 넘는 야간 침투 기동 승인"</w:t>
       </w:r>
@@ -2894,7 +3086,7 @@
           <w:rFonts w:ascii="Consolas" w:hAnsi="Consolas" w:eastAsia="Consolas"/>
           <w:b w:val="0"/>
           <w:color w:val="52514E"/>
-          <w:sz w:val="17"/>
+          <w:sz w:val="16"/>
         </w:rPr>
         <w:t>[governance] risk=HIGH approved=False ...</w:t>
       </w:r>
@@ -2909,7 +3101,7 @@
           <w:rFonts w:ascii="Consolas" w:hAnsi="Consolas" w:eastAsia="Consolas"/>
           <w:b w:val="0"/>
           <w:color w:val="52514E"/>
-          <w:sz w:val="17"/>
+          <w:sz w:val="16"/>
         </w:rPr>
         <w:t>[status] PENDING_APPROVAL          ← --approve로만 실행 가능</w:t>
       </w:r>
@@ -2980,7 +3172,7 @@
           <w:rFonts w:ascii="Consolas" w:hAnsi="Consolas" w:eastAsia="Consolas"/>
           <w:b w:val="0"/>
           <w:color w:val="52514E"/>
-          <w:sz w:val="17"/>
+          <w:sz w:val="16"/>
         </w:rPr>
         <w:t>{</w:t>
       </w:r>
@@ -2995,7 +3187,7 @@
           <w:rFonts w:ascii="Consolas" w:hAnsi="Consolas" w:eastAsia="Consolas"/>
           <w:b w:val="0"/>
           <w:color w:val="52514E"/>
-          <w:sz w:val="17"/>
+          <w:sz w:val="16"/>
         </w:rPr>
         <w:t xml:space="preserve">  "purpose": "적 방어선 돌파로 후속 부대 진출 여건 보장",</w:t>
       </w:r>
@@ -3010,7 +3202,7 @@
           <w:rFonts w:ascii="Consolas" w:hAnsi="Consolas" w:eastAsia="Consolas"/>
           <w:b w:val="0"/>
           <w:color w:val="52514E"/>
-          <w:sz w:val="17"/>
+          <w:sz w:val="16"/>
         </w:rPr>
         <w:t xml:space="preserve">  "end_state": "주교량 확보 및 적 포병 무력화 상태",</w:t>
       </w:r>
@@ -3025,7 +3217,7 @@
           <w:rFonts w:ascii="Consolas" w:hAnsi="Consolas" w:eastAsia="Consolas"/>
           <w:b w:val="0"/>
           <w:color w:val="52514E"/>
-          <w:sz w:val="17"/>
+          <w:sz w:val="16"/>
         </w:rPr>
         <w:t xml:space="preserve">  "key_tasks": ["교량 확보", "적 포병 무력화"],</w:t>
       </w:r>
@@ -3040,7 +3232,7 @@
           <w:rFonts w:ascii="Consolas" w:hAnsi="Consolas" w:eastAsia="Consolas"/>
           <w:b w:val="0"/>
           <w:color w:val="52514E"/>
-          <w:sz w:val="17"/>
+          <w:sz w:val="16"/>
         </w:rPr>
         <w:t xml:space="preserve">  "constraints": ["민간 지역 포격 금지"],</w:t>
       </w:r>
@@ -3055,7 +3247,7 @@
           <w:rFonts w:ascii="Consolas" w:hAnsi="Consolas" w:eastAsia="Consolas"/>
           <w:b w:val="0"/>
           <w:color w:val="52514E"/>
-          <w:sz w:val="17"/>
+          <w:sz w:val="16"/>
         </w:rPr>
         <w:t xml:space="preserve">  "acceptable_risks": ["야간 기동 간 소부대 고립"]</w:t>
       </w:r>
@@ -3070,7 +3262,7 @@
           <w:rFonts w:ascii="Consolas" w:hAnsi="Consolas" w:eastAsia="Consolas"/>
           <w:b w:val="0"/>
           <w:color w:val="52514E"/>
-          <w:sz w:val="17"/>
+          <w:sz w:val="16"/>
         </w:rPr>
         <w:t>}</w:t>
       </w:r>
@@ -3085,7 +3277,7 @@
           <w:rFonts w:ascii="Consolas" w:hAnsi="Consolas" w:eastAsia="Consolas"/>
           <w:b w:val="0"/>
           <w:color w:val="52514E"/>
-          <w:sz w:val="17"/>
+          <w:sz w:val="16"/>
         </w:rPr>
         <w:t>maios align 1중대가 교량을 확보하고 통로 개척</w:t>
       </w:r>
@@ -3100,7 +3292,7 @@
           <w:rFonts w:ascii="Consolas" w:hAnsi="Consolas" w:eastAsia="Consolas"/>
           <w:b w:val="0"/>
           <w:color w:val="52514E"/>
-          <w:sz w:val="17"/>
+          <w:sz w:val="16"/>
         </w:rPr>
         <w:t>[verdict] ALIGNED      ← 핵심과업 지원: 교량 확보</w:t>
       </w:r>
@@ -3115,7 +3307,7 @@
           <w:rFonts w:ascii="Consolas" w:hAnsi="Consolas" w:eastAsia="Consolas"/>
           <w:b w:val="0"/>
           <w:color w:val="52514E"/>
-          <w:sz w:val="17"/>
+          <w:sz w:val="16"/>
         </w:rPr>
         <w:t xml:space="preserve"> </w:t>
       </w:r>
@@ -3130,7 +3322,7 @@
           <w:rFonts w:ascii="Consolas" w:hAnsi="Consolas" w:eastAsia="Consolas"/>
           <w:b w:val="0"/>
           <w:color w:val="52514E"/>
-          <w:sz w:val="17"/>
+          <w:sz w:val="16"/>
         </w:rPr>
         <w:t>maios align 민간 지역 인근 포격 준비</w:t>
       </w:r>
@@ -3145,7 +3337,7 @@
           <w:rFonts w:ascii="Consolas" w:hAnsi="Consolas" w:eastAsia="Consolas"/>
           <w:b w:val="0"/>
           <w:color w:val="52514E"/>
-          <w:sz w:val="17"/>
+          <w:sz w:val="16"/>
         </w:rPr>
         <w:t>[verdict] CONFLICT     ← 제한사항과 충돌</w:t>
       </w:r>
@@ -3160,7 +3352,7 @@
           <w:rFonts w:ascii="Consolas" w:hAnsi="Consolas" w:eastAsia="Consolas"/>
           <w:b w:val="0"/>
           <w:color w:val="52514E"/>
-          <w:sz w:val="17"/>
+          <w:sz w:val="16"/>
         </w:rPr>
         <w:t xml:space="preserve"> </w:t>
       </w:r>
@@ -3175,7 +3367,7 @@
           <w:rFonts w:ascii="Consolas" w:hAnsi="Consolas" w:eastAsia="Consolas"/>
           <w:b w:val="0"/>
           <w:color w:val="52514E"/>
-          <w:sz w:val="17"/>
+          <w:sz w:val="16"/>
         </w:rPr>
         <w:t>maios pursue "민간 지역 포격 계획 수립"</w:t>
       </w:r>
@@ -3190,7 +3382,7 @@
           <w:rFonts w:ascii="Consolas" w:hAnsi="Consolas" w:eastAsia="Consolas"/>
           <w:b w:val="0"/>
           <w:color w:val="52514E"/>
-          <w:sz w:val="17"/>
+          <w:sz w:val="16"/>
         </w:rPr>
         <w:t>[alignment] CONFLICT - 제한사항과 충돌: 민간 지역 포격 금지</w:t>
       </w:r>
@@ -3205,7 +3397,7 @@
           <w:rFonts w:ascii="Consolas" w:hAnsi="Consolas" w:eastAsia="Consolas"/>
           <w:b w:val="0"/>
           <w:color w:val="52514E"/>
-          <w:sz w:val="17"/>
+          <w:sz w:val="16"/>
         </w:rPr>
         <w:t>[status] PENDING_APPROVAL   ← 충돌 목표는 자동으로 인간 승인 관문 통과 필요</w:t>
       </w:r>
@@ -3252,7 +3444,7 @@
           <w:b w:val="0"/>
           <w:sz w:val="21"/>
         </w:rPr>
-        <w:t xml:space="preserve">(연결 미확인 — 인간 확인 권장) / </w:t>
+        <w:t xml:space="preserve">(연결 미확인 — 인간 확인 필요) / </w:t>
       </w:r>
       <w:r>
         <w:rPr>
@@ -3311,7 +3503,7 @@
           <w:rFonts w:ascii="Consolas" w:hAnsi="Consolas" w:eastAsia="Consolas"/>
           <w:b w:val="0"/>
           <w:color w:val="52514E"/>
-          <w:sz w:val="17"/>
+          <w:sz w:val="16"/>
         </w:rPr>
         <w:t>.maios/</w:t>
       </w:r>
@@ -3326,7 +3518,7 @@
           <w:rFonts w:ascii="Consolas" w:hAnsi="Consolas" w:eastAsia="Consolas"/>
           <w:b w:val="0"/>
           <w:color w:val="52514E"/>
-          <w:sz w:val="17"/>
+          <w:sz w:val="16"/>
         </w:rPr>
         <w:t>├── knowledge_graph.json   지식그래프 (문서·경험·성찰·개념 노드와 관계)</w:t>
       </w:r>
@@ -3341,7 +3533,7 @@
           <w:rFonts w:ascii="Consolas" w:hAnsi="Consolas" w:eastAsia="Consolas"/>
           <w:b w:val="0"/>
           <w:color w:val="52514E"/>
-          <w:sz w:val="17"/>
+          <w:sz w:val="16"/>
         </w:rPr>
         <w:t>├── memory_store.json      장기 기억 저장소</w:t>
       </w:r>
@@ -3356,7 +3548,7 @@
           <w:rFonts w:ascii="Consolas" w:hAnsi="Consolas" w:eastAsia="Consolas"/>
           <w:b w:val="0"/>
           <w:color w:val="52514E"/>
-          <w:sz w:val="17"/>
+          <w:sz w:val="16"/>
         </w:rPr>
         <w:t>├── pursuits.json          목표 수행 일지 (교훈·산출물 포함)</w:t>
       </w:r>
@@ -3371,7 +3563,7 @@
           <w:rFonts w:ascii="Consolas" w:hAnsi="Consolas" w:eastAsia="Consolas"/>
           <w:b w:val="0"/>
           <w:color w:val="52514E"/>
-          <w:sz w:val="17"/>
+          <w:sz w:val="16"/>
         </w:rPr>
         <w:t>├── projects.json          프로젝트 일지</w:t>
       </w:r>
@@ -3386,7 +3578,7 @@
           <w:rFonts w:ascii="Consolas" w:hAnsi="Consolas" w:eastAsia="Consolas"/>
           <w:b w:val="0"/>
           <w:color w:val="52514E"/>
-          <w:sz w:val="17"/>
+          <w:sz w:val="16"/>
         </w:rPr>
         <w:t>└── artifacts/             산출물 (GP-*.md = 목표, PJ-*.md = 프로젝트)</w:t>
       </w:r>
@@ -3519,6 +3711,10 @@
         <w:gridCol w:w="2154"/>
       </w:tblGrid>
       <w:tr>
+        <w:trPr>
+          <w:cantSplit/>
+          <w:tblHeader/>
+        </w:trPr>
         <w:tc>
           <w:tcPr>
             <w:tcW w:type="dxa" w:w="2154"/>
@@ -3566,6 +3762,9 @@
         </w:tc>
       </w:tr>
       <w:tr>
+        <w:trPr>
+          <w:cantSplit/>
+        </w:trPr>
         <w:tc>
           <w:tcPr>
             <w:tcW w:type="dxa" w:w="2154"/>
@@ -3613,6 +3812,9 @@
         </w:tc>
       </w:tr>
       <w:tr>
+        <w:trPr>
+          <w:cantSplit/>
+        </w:trPr>
         <w:tc>
           <w:tcPr>
             <w:tcW w:type="dxa" w:w="2154"/>
@@ -3684,6 +3886,9 @@
         </w:tc>
       </w:tr>
       <w:tr>
+        <w:trPr>
+          <w:cantSplit/>
+        </w:trPr>
         <w:tc>
           <w:tcPr>
             <w:tcW w:type="dxa" w:w="2154"/>
@@ -3819,7 +4024,7 @@
           <w:rFonts w:ascii="Consolas" w:hAnsi="Consolas" w:eastAsia="Consolas"/>
           <w:b w:val="0"/>
           <w:color w:val="52514E"/>
-          <w:sz w:val="17"/>
+          <w:sz w:val="16"/>
         </w:rPr>
         <w:t>maios ingest ~/책원고                    # 원고 전체 흡수</w:t>
       </w:r>
@@ -3834,7 +4039,7 @@
           <w:rFonts w:ascii="Consolas" w:hAnsi="Consolas" w:eastAsia="Consolas"/>
           <w:b w:val="0"/>
           <w:color w:val="52514E"/>
-          <w:sz w:val="17"/>
+          <w:sz w:val="16"/>
         </w:rPr>
         <w:t>maios shell --llm claude</w:t>
       </w:r>
@@ -3849,7 +4054,7 @@
           <w:rFonts w:ascii="Consolas" w:hAnsi="Consolas" w:eastAsia="Consolas"/>
           <w:b w:val="0"/>
           <w:color w:val="52514E"/>
-          <w:sz w:val="17"/>
+          <w:sz w:val="16"/>
         </w:rPr>
         <w:t>maios&gt; /research 3장과 7장의 논리적 충돌은 없는가?</w:t>
       </w:r>
@@ -3864,7 +4069,7 @@
           <w:rFonts w:ascii="Consolas" w:hAnsi="Consolas" w:eastAsia="Consolas"/>
           <w:b w:val="0"/>
           <w:color w:val="52514E"/>
-          <w:sz w:val="17"/>
+          <w:sz w:val="16"/>
         </w:rPr>
         <w:t>maios&gt; 4장 도입부를 두 문단으로 다시 써줘   # 회상이 원고 맥락을 주입</w:t>
       </w:r>
@@ -3879,7 +4084,7 @@
           <w:rFonts w:ascii="Consolas" w:hAnsi="Consolas" w:eastAsia="Consolas"/>
           <w:b w:val="0"/>
           <w:color w:val="52514E"/>
-          <w:sz w:val="17"/>
+          <w:sz w:val="16"/>
         </w:rPr>
         <w:t>maios&gt; /project 출판사 투고용 시놉시스 작성</w:t>
       </w:r>
@@ -3908,7 +4113,7 @@
           <w:rFonts w:ascii="Consolas" w:hAnsi="Consolas" w:eastAsia="Consolas"/>
           <w:b w:val="0"/>
           <w:color w:val="52514E"/>
-          <w:sz w:val="17"/>
+          <w:sz w:val="16"/>
         </w:rPr>
         <w:t>maios ingest ~/수집자료/                 # 수시로 자료 추가 (재흡수 안전)</w:t>
       </w:r>
@@ -3923,7 +4128,7 @@
           <w:rFonts w:ascii="Consolas" w:hAnsi="Consolas" w:eastAsia="Consolas"/>
           <w:b w:val="0"/>
           <w:color w:val="52514E"/>
-          <w:sz w:val="17"/>
+          <w:sz w:val="16"/>
         </w:rPr>
         <w:t>maios research "수집 자료에서 상반되는 주장 정리"</w:t>
       </w:r>
@@ -3938,7 +4143,7 @@
           <w:rFonts w:ascii="Consolas" w:hAnsi="Consolas" w:eastAsia="Consolas"/>
           <w:b w:val="0"/>
           <w:color w:val="52514E"/>
-          <w:sz w:val="17"/>
+          <w:sz w:val="16"/>
         </w:rPr>
         <w:t># 보고서가 지식그래프에 쌓임 → 다음 연구가 이전 연구를 인용</w:t>
       </w:r>
@@ -3980,7 +4185,7 @@
           <w:rFonts w:ascii="Consolas" w:hAnsi="Consolas" w:eastAsia="Consolas"/>
           <w:b w:val="0"/>
           <w:color w:val="52514E"/>
-          <w:sz w:val="17"/>
+          <w:sz w:val="16"/>
         </w:rPr>
         <w:t>maios pursue "오늘자 안보 뉴스 다섯 꼭지 요약" --llm claude</w:t>
       </w:r>
@@ -4022,7 +4227,7 @@
           <w:rFonts w:ascii="Consolas" w:hAnsi="Consolas" w:eastAsia="Consolas"/>
           <w:b w:val="0"/>
           <w:color w:val="52514E"/>
-          <w:sz w:val="17"/>
+          <w:sz w:val="16"/>
         </w:rPr>
         <w:t>from maios.governance import GovernanceManager</w:t>
       </w:r>
@@ -4037,7 +4242,7 @@
           <w:rFonts w:ascii="Consolas" w:hAnsi="Consolas" w:eastAsia="Consolas"/>
           <w:b w:val="0"/>
           <w:color w:val="52514E"/>
-          <w:sz w:val="17"/>
+          <w:sz w:val="16"/>
         </w:rPr>
         <w:t>from maios.kernel import DocumentIngestor, Workspace</w:t>
       </w:r>
@@ -4052,7 +4257,7 @@
           <w:rFonts w:ascii="Consolas" w:hAnsi="Consolas" w:eastAsia="Consolas"/>
           <w:b w:val="0"/>
           <w:color w:val="52514E"/>
-          <w:sz w:val="17"/>
+          <w:sz w:val="16"/>
         </w:rPr>
         <w:t>from maios.adapters.llm_provider import create_llm_provider</w:t>
       </w:r>
@@ -4067,7 +4272,7 @@
           <w:rFonts w:ascii="Consolas" w:hAnsi="Consolas" w:eastAsia="Consolas"/>
           <w:b w:val="0"/>
           <w:color w:val="52514E"/>
-          <w:sz w:val="17"/>
+          <w:sz w:val="16"/>
         </w:rPr>
         <w:t>from maios.config import load_config</w:t>
       </w:r>
@@ -4082,7 +4287,7 @@
           <w:rFonts w:ascii="Consolas" w:hAnsi="Consolas" w:eastAsia="Consolas"/>
           <w:b w:val="0"/>
           <w:color w:val="52514E"/>
-          <w:sz w:val="17"/>
+          <w:sz w:val="16"/>
         </w:rPr>
         <w:t xml:space="preserve"> </w:t>
       </w:r>
@@ -4097,7 +4302,7 @@
           <w:rFonts w:ascii="Consolas" w:hAnsi="Consolas" w:eastAsia="Consolas"/>
           <w:b w:val="0"/>
           <w:color w:val="52514E"/>
-          <w:sz w:val="17"/>
+          <w:sz w:val="16"/>
         </w:rPr>
         <w:t>config = load_config()</w:t>
       </w:r>
@@ -4112,7 +4317,7 @@
           <w:rFonts w:ascii="Consolas" w:hAnsi="Consolas" w:eastAsia="Consolas"/>
           <w:b w:val="0"/>
           <w:color w:val="52514E"/>
-          <w:sz w:val="17"/>
+          <w:sz w:val="16"/>
         </w:rPr>
         <w:t>config.model_provider = "claude"</w:t>
       </w:r>
@@ -4127,7 +4332,7 @@
           <w:rFonts w:ascii="Consolas" w:hAnsi="Consolas" w:eastAsia="Consolas"/>
           <w:b w:val="0"/>
           <w:color w:val="52514E"/>
-          <w:sz w:val="17"/>
+          <w:sz w:val="16"/>
         </w:rPr>
         <w:t>provider = create_llm_provider(config)</w:t>
       </w:r>
@@ -4142,7 +4347,7 @@
           <w:rFonts w:ascii="Consolas" w:hAnsi="Consolas" w:eastAsia="Consolas"/>
           <w:b w:val="0"/>
           <w:color w:val="52514E"/>
-          <w:sz w:val="17"/>
+          <w:sz w:val="16"/>
         </w:rPr>
         <w:t xml:space="preserve"> </w:t>
       </w:r>
@@ -4157,7 +4362,7 @@
           <w:rFonts w:ascii="Consolas" w:hAnsi="Consolas" w:eastAsia="Consolas"/>
           <w:b w:val="0"/>
           <w:color w:val="52514E"/>
-          <w:sz w:val="17"/>
+          <w:sz w:val="16"/>
         </w:rPr>
         <w:t>space = Workspace(".maios")</w:t>
       </w:r>
@@ -4172,7 +4377,7 @@
           <w:rFonts w:ascii="Consolas" w:hAnsi="Consolas" w:eastAsia="Consolas"/>
           <w:b w:val="0"/>
           <w:color w:val="52514E"/>
-          <w:sz w:val="17"/>
+          <w:sz w:val="16"/>
         </w:rPr>
         <w:t>agi = space.build_foundation(governance=GovernanceManager(), llm_provider=provider)</w:t>
       </w:r>
@@ -4187,7 +4392,7 @@
           <w:rFonts w:ascii="Consolas" w:hAnsi="Consolas" w:eastAsia="Consolas"/>
           <w:b w:val="0"/>
           <w:color w:val="52514E"/>
-          <w:sz w:val="17"/>
+          <w:sz w:val="16"/>
         </w:rPr>
         <w:t xml:space="preserve"> </w:t>
       </w:r>
@@ -4202,7 +4407,7 @@
           <w:rFonts w:ascii="Consolas" w:hAnsi="Consolas" w:eastAsia="Consolas"/>
           <w:b w:val="0"/>
           <w:color w:val="52514E"/>
-          <w:sz w:val="17"/>
+          <w:sz w:val="16"/>
         </w:rPr>
         <w:t>DocumentIngestor(agi.knowledge_graph).ingest("~/문서")   # ~ 자동 확장</w:t>
       </w:r>
@@ -4217,7 +4422,7 @@
           <w:rFonts w:ascii="Consolas" w:hAnsi="Consolas" w:eastAsia="Consolas"/>
           <w:b w:val="0"/>
           <w:color w:val="52514E"/>
-          <w:sz w:val="17"/>
+          <w:sz w:val="16"/>
         </w:rPr>
         <w:t>pursuit = agi.pursue("문서 핵심을 요약", capabilities=())</w:t>
       </w:r>
@@ -4232,7 +4437,7 @@
           <w:rFonts w:ascii="Consolas" w:hAnsi="Consolas" w:eastAsia="Consolas"/>
           <w:b w:val="0"/>
           <w:color w:val="52514E"/>
-          <w:sz w:val="17"/>
+          <w:sz w:val="16"/>
         </w:rPr>
         <w:t>project = agi.pursue_project("2부작 브리핑 작성")</w:t>
       </w:r>
@@ -4247,7 +4452,7 @@
           <w:rFonts w:ascii="Consolas" w:hAnsi="Consolas" w:eastAsia="Consolas"/>
           <w:b w:val="0"/>
           <w:color w:val="52514E"/>
-          <w:sz w:val="17"/>
+          <w:sz w:val="16"/>
         </w:rPr>
         <w:t>report = agi.evolve()          # 누적 성공률·교훈</w:t>
       </w:r>
@@ -4262,7 +4467,7 @@
           <w:rFonts w:ascii="Consolas" w:hAnsi="Consolas" w:eastAsia="Consolas"/>
           <w:b w:val="0"/>
           <w:color w:val="52514E"/>
-          <w:sz w:val="17"/>
+          <w:sz w:val="16"/>
         </w:rPr>
         <w:t>model = agi.introspect()       # 자기 모델</w:t>
       </w:r>
@@ -4277,7 +4482,7 @@
           <w:rFonts w:ascii="Consolas" w:hAnsi="Consolas" w:eastAsia="Consolas"/>
           <w:b w:val="0"/>
           <w:color w:val="52514E"/>
-          <w:sz w:val="17"/>
+          <w:sz w:val="16"/>
         </w:rPr>
         <w:t>space.save(agi)                # 일지·산출물 저장</w:t>
       </w:r>
@@ -4353,6 +4558,10 @@
         <w:gridCol w:w="3231"/>
       </w:tblGrid>
       <w:tr>
+        <w:trPr>
+          <w:cantSplit/>
+          <w:tblHeader/>
+        </w:trPr>
         <w:tc>
           <w:tcPr>
             <w:tcW w:type="dxa" w:w="3231"/>
@@ -4385,6 +4594,9 @@
         </w:tc>
       </w:tr>
       <w:tr>
+        <w:trPr>
+          <w:cantSplit/>
+        </w:trPr>
         <w:tc>
           <w:tcPr>
             <w:tcW w:type="dxa" w:w="3231"/>
@@ -4441,6 +4653,9 @@
         </w:tc>
       </w:tr>
       <w:tr>
+        <w:trPr>
+          <w:cantSplit/>
+        </w:trPr>
         <w:tc>
           <w:tcPr>
             <w:tcW w:type="dxa" w:w="3231"/>
@@ -4473,6 +4688,9 @@
         </w:tc>
       </w:tr>
       <w:tr>
+        <w:trPr>
+          <w:cantSplit/>
+        </w:trPr>
         <w:tc>
           <w:tcPr>
             <w:tcW w:type="dxa" w:w="3231"/>
@@ -4521,6 +4739,9 @@
         </w:tc>
       </w:tr>
       <w:tr>
+        <w:trPr>
+          <w:cantSplit/>
+        </w:trPr>
         <w:tc>
           <w:tcPr>
             <w:tcW w:type="dxa" w:w="3231"/>
@@ -4553,6 +4774,9 @@
         </w:tc>
       </w:tr>
       <w:tr>
+        <w:trPr>
+          <w:cantSplit/>
+        </w:trPr>
         <w:tc>
           <w:tcPr>
             <w:tcW w:type="dxa" w:w="3231"/>
@@ -4585,6 +4809,9 @@
         </w:tc>
       </w:tr>
       <w:tr>
+        <w:trPr>
+          <w:cantSplit/>
+        </w:trPr>
         <w:tc>
           <w:tcPr>
             <w:tcW w:type="dxa" w:w="3231"/>
@@ -4617,6 +4844,9 @@
         </w:tc>
       </w:tr>
       <w:tr>
+        <w:trPr>
+          <w:cantSplit/>
+        </w:trPr>
         <w:tc>
           <w:tcPr>
             <w:tcW w:type="dxa" w:w="3231"/>
@@ -4677,7 +4907,7 @@
           <w:rFonts w:ascii="Consolas" w:hAnsi="Consolas" w:eastAsia="Consolas"/>
           <w:b w:val="0"/>
           <w:color w:val="52514E"/>
-          <w:sz w:val="17"/>
+          <w:sz w:val="16"/>
         </w:rPr>
         <w:t>python scripts/validate_live.py --provider mock    # 오프라인 점검</w:t>
       </w:r>
@@ -4692,7 +4922,7 @@
           <w:rFonts w:ascii="Consolas" w:hAnsi="Consolas" w:eastAsia="Consolas"/>
           <w:b w:val="0"/>
           <w:color w:val="52514E"/>
-          <w:sz w:val="17"/>
+          <w:sz w:val="16"/>
         </w:rPr>
         <w:t>python scripts/validate_live.py                    # 실모델 점검 (키·크레딧 필요)</w:t>
       </w:r>
@@ -4939,7 +5169,7 @@
           <w:b w:val="0"/>
           <w:sz w:val="21"/>
         </w:rPr>
-        <w:t>대화형 AI의 능력이 급성장했음에도 그 사용 형태는 여전히 세션 단위의 휘발적 문답에 머물러 있다. 본 논문은 AI를 "질문에 답하는 도구"가 아니라 "임무를 중심으로 운용되는 체계"로 재구성한 로컬 AI 운영체제 MAIOS(MUSA AI Operating System)의 설계와 구현, 그리고 실사용 코퍼스 기반 실증 결과를 보고한다. MAIOS는 (1) 관찰-이해-계획-행동-성찰-학습의 6단계 인지 루프, (2) 지식그래프·수행일지·산출물로 구성되어 실행 간 지속되는 워크스페이스 기억, (3) 새 목표 수행 시 과거 경험과 문서를 자동 회수해 프롬프트에 주입하는 기억 회상, (4) 고위험 목표를 차단하고 인간 승인을 요구하는 거버넌스 게이트를 통합한다. 모든 LLM 의존 단계는 프로바이더 부재 시 결정론적 휴리스틱으로 대체되는 폴백 설계를 따르며, 이로써 전체 시스템이 API 접근 없이 시험 가능하다(본고 시점 테스트 506개, 분기 커버리지 95.9%). 실제 저술 코퍼스(33개 파일, 728KB)를 이용한 실증에서 단위 시험이 포착하지 못한 세 가지 규모 결함 — 삽입당 전체 영속화와 이차적 자동 연결의 결합, 수행 기록이 자기 자신을 재섭취하는 되먹임 팽창(단일 노드 6.7MB 도달), 토큰화기의 한글 불가시성 — 을 발견·수정하였고, 수정 후 대량 흡수는 1초 미만, 반복 질의는 약 1.2초에 안정화되었다. 나아가 형식 온톨로지 (RDFS/OWL)를 회상·거버넌스·의도 정렬의 세 지점에 결합하는 적용 연구를 수행하여, 실제 군 임무형지휘 온톨로지를 이용해 (a) 표층 어휘가 전혀 겹치지 않는 문서의 개념적 회수, (b) 온톨로지 개념 이웃에 기반한 위험 상향과 인간 승인 요구, (c) 지휘관 의도 5요소에 대한 행동 정렬 판정 (ALIGNED/CHECK/CONFLICT)을 시연하였다. 본 연구는 개인 지식노동의 맥락에서 "기억하는 AI 체계"가 부딪히는 실제 공학 문제와 그 해법, 그리고 군 지휘 이론과 소프트웨어 통제의 접합 가능성을 구체적 실증과 함께 제시한다는 점에서 기여를 갖는다.</w:t>
+        <w:t>대화형 AI의 능력이 급성장했음에도 그 사용 형태는 여전히 세션 단위의 휘발적 문답에 머물러 있다. 본 논문은 AI를 "질문에 답하는 도구"가 아니라 "임무를 중심으로 운용되는 체계"로 재구성한 로컬 AI 운영체제 MAIOS(MUSA AI Operating System)의 설계와 구현, 그리고 실사용 코퍼스 기반 실증 결과를 보고한다. MAIOS는 (1) 관찰-이해-계획-행동-성찰-학습의 6단계 인지 루프, (2) 지식그래프·수행일지·산출물로 구성되어 실행 간 지속되는 워크스페이스 기억, (3) 새 목표 수행 시 과거 경험과 문서를 자동 회수해 프롬프트에 주입하는 기억 회상, (4) 고위험 목표를 차단하고 인간 승인을 요구하는 거버넌스 게이트를 통합한다. 모든 LLM 의존 단계는 프로바이더 부재 시 결정론적 휴리스틱으로 대체되는 폴백 설계를 따르며, 이로써 전체 시스템이 API 접근 없이 시험 가능하다(본고 시점 테스트 506개, 분기 포함 커버리지 95.9%). 실제 저술 코퍼스(33개 파일, 728KB)를 이용한 실증에서 단위 시험이 포착하지 못한 세 가지 규모 결함 — 삽입당 전체 영속화와 이차적 자동 연결의 결합, 수행 기록이 자기 자신을 재섭취하는 되먹임 팽창(단일 노드 6.7MB 도달), 토큰화기의 한글 불가시성 — 을 발견·수정하였고, 수정 후 대량 흡수는 1초 미만, 반복 질의는 약 1.2초에 안정화되었다. 나아가 형식 온톨로지 (RDFS/OWL)를 회상·거버넌스·의도 정렬의 세 지점에 결합하는 적용 연구를 수행하여, 실제 군 임무형지휘 온톨로지(의도 핵심부 발췌본)를 이용해 (a) 표층 어휘가 전혀 겹치지 않는 문서의 개념적 회수, (b) 온톨로지 개념 이웃에 기반한 위험 상향과 인간 승인 요구, (c) 지휘관 의도 5요소에 대한 행동 정렬 판정 (ALIGNED/CHECK/CONFLICT)을 시연하였다. 본 연구는 개인 지식노동의 맥락에서 "기억하는 AI 체계"가 부딪히는 실제 공학 문제와 그 해법, 그리고 군 지휘 이론과 소프트웨어 통제의 접합 가능성을 구체적 실증과 함께 제시한다는 점에서 기여를 갖는다.</w:t>
       </w:r>
     </w:p>
     <w:p>
@@ -5146,7 +5376,7 @@
           <w:b w:val="0"/>
           <w:sz w:val="21"/>
         </w:rPr>
-        <w:t>1. 인지 루프·영속 기억·회상·거버넌스를 단일 체계로 통합한 공개 구현체 (GitHub, MIT 라이선스, v1.3.0 기준 테스트 478개·본고 시점 506개, 분기 커버리지 약 96%).</w:t>
+        <w:t>1. 인지 루프·영속 기억·회상·거버넌스를 단일 체계로 통합한 공개 구현체 (GitHub, MIT 라이선스, v1.3.0 기준 테스트 478개·본고 시점 506개, 분기 포함 커버리지 약 96%).</w:t>
       </w:r>
     </w:p>
     <w:p>
@@ -5311,7 +5541,7 @@
           <w:b w:val="0"/>
           <w:sz w:val="21"/>
         </w:rPr>
-        <w:t xml:space="preserve"> SOAR[6], ACT-R[7], BDI[8] 등 고전 인지 아키텍처는 지각-결정- 행동 순환과 장기/작업 기억의 분리를 정식화했다. MAIOS의 6단계 루프는 이 전통의 경량 실용화로 볼 수 있으며, 차이는 각 단계가 LLM 호출로 증강되되 호출 실패 시 결정론적으로 퇴행한다는 점이다.</w:t>
+        <w:t xml:space="preserve"> SOAR[6], ACT-R[7], BDI[8] 등 고전 인지·에이전트 아키텍처는 지각-결정- 행동 순환과 장기/작업 기억의 분리를 정식화했다. MAIOS의 6단계 루프는 이 전통의 경량 실용화로 볼 수 있으며, 차이는 각 단계가 LLM 호출로 증강되되 호출 실패 시 결정론적으로 퇴행한다는 점이다.</w:t>
       </w:r>
     </w:p>
     <w:p>
@@ -5374,6 +5604,10 @@
         <w:gridCol w:w="3231"/>
       </w:tblGrid>
       <w:tr>
+        <w:trPr>
+          <w:cantSplit/>
+          <w:tblHeader/>
+        </w:trPr>
         <w:tc>
           <w:tcPr>
             <w:tcW w:type="dxa" w:w="3231"/>
@@ -5406,6 +5640,9 @@
         </w:tc>
       </w:tr>
       <w:tr>
+        <w:trPr>
+          <w:cantSplit/>
+        </w:trPr>
         <w:tc>
           <w:tcPr>
             <w:tcW w:type="dxa" w:w="3231"/>
@@ -5438,6 +5675,9 @@
         </w:tc>
       </w:tr>
       <w:tr>
+        <w:trPr>
+          <w:cantSplit/>
+        </w:trPr>
         <w:tc>
           <w:tcPr>
             <w:tcW w:type="dxa" w:w="3231"/>
@@ -5470,6 +5710,9 @@
         </w:tc>
       </w:tr>
       <w:tr>
+        <w:trPr>
+          <w:cantSplit/>
+        </w:trPr>
         <w:tc>
           <w:tcPr>
             <w:tcW w:type="dxa" w:w="3231"/>
@@ -5502,6 +5745,9 @@
         </w:tc>
       </w:tr>
       <w:tr>
+        <w:trPr>
+          <w:cantSplit/>
+        </w:trPr>
         <w:tc>
           <w:tcPr>
             <w:tcW w:type="dxa" w:w="3231"/>
@@ -5534,6 +5780,9 @@
         </w:tc>
       </w:tr>
       <w:tr>
+        <w:trPr>
+          <w:cantSplit/>
+        </w:trPr>
         <w:tc>
           <w:tcPr>
             <w:tcW w:type="dxa" w:w="3231"/>
@@ -5566,6 +5815,9 @@
         </w:tc>
       </w:tr>
       <w:tr>
+        <w:trPr>
+          <w:cantSplit/>
+        </w:trPr>
         <w:tc>
           <w:tcPr>
             <w:tcW w:type="dxa" w:w="3231"/>
@@ -5680,6 +5932,7 @@
     </w:p>
     <w:p>
       <w:pPr>
+        <w:keepNext/>
         <w:spacing w:before="200"/>
         <w:jc w:val="center"/>
       </w:pPr>
@@ -5944,7 +6197,7 @@
           <w:b w:val="0"/>
           <w:sz w:val="21"/>
         </w:rPr>
-        <w:t>모든 커밋은 black(포맷), ruff(린트), mypy(타입), pytest(분기 커버리지 95% 강제)를 통과해야 하며 GitHub Actions CI가 Python 3.11/3.12에서 동일 게이트를 재검한다. v1.3.0 기준 테스트 478개(본고 시점 506개), 분기 커버리지 약 96%이며, 인지 계층 모듈 대부분(루프·해석기·회상· 실행기·분해기·흡수기·워크스페이스·통합 계층)이 문장 기준 100%, 나머지(집행 두뇌·세계 모델)는 96~97%다. P7(폴백 설계) 덕분에 이 모든 검증은 네트워크 접근 없이 수행된다. LLM 경로 자체는 스크립트드 프로바이더(응답 대본 주입)로 시험하며, 실모델 종단 검증용 하네스 (</w:t>
+        <w:t>모든 커밋은 black(포맷), ruff(린트), mypy(타입), pytest(분기 커버리지 95% 강제)를 통과해야 하며 GitHub Actions CI가 Python 3.11/3.12에서 동일 게이트를 재검한다. v1.3.0 기준 테스트 478개(본고 시점 506개), 분기 포함 커버리지 약 96%(CLI 진입 모듈은 산정에서 제외)이며, 인지 계층 모듈 대부분(루프·해석기·회상· 실행기·분해기·흡수기·워크스페이스·통합 계층)이 문장 기준 100%, 나머지(집행 두뇌·세계 모델)는 96~97%다. P7(폴백 설계) 덕분에 이 모든 검증은 네트워크 접근 없이 수행된다. LLM 경로 자체는 스크립트드 프로바이더(응답 대본 주입)로 시험하며, 실모델 종단 검증용 하네스 (</w:t>
       </w:r>
       <w:r>
         <w:rPr>
@@ -5965,6 +6218,7 @@
     </w:p>
     <w:p>
       <w:pPr>
+        <w:keepNext/>
         <w:spacing w:before="200"/>
         <w:jc w:val="center"/>
       </w:pPr>
@@ -6043,7 +6297,7 @@
           <w:b w:val="0"/>
           <w:sz w:val="21"/>
         </w:rPr>
-        <w:t>단위 시험이 모두 통과한 상태에서, 저자 본인의 실제 저술 코퍼스 (단행본 원고 폴더: 33개 파일, 728KB, 한국어 위주)를 흡수·질의하는 실증을 수행했다. 그 결과 시험이 포착하지 못한 세 가지 규모 결함이 드러났다. 각 결함과 수정, 정량 효과는 다음과 같다.</w:t>
+        <w:t>단위 시험이 모두 통과한 상태에서, 저자 본인의 실제 저술 코퍼스 (단행본 원고 폴더: 33개 파일, 728KB, 한국어 위주)를 흡수·질의하는 실증을 수행했다. 그 결과 시험이 포착하지 못한 세 가지 규모 결함이 드러났다. 본 절의 시간·용량 수치는 저자의 단일 개발 머신(Windows 11) 에서 개발 세션 중 실측한 단일 실행 값으로, 통계적 반복 측정이 아니라 규모 등급의 차이(초 대 분, KB 대 MB)를 보고하는 것이다. 각 결함과 수정, 정량 효과는 다음과 같다.</w:t>
       </w:r>
     </w:p>
     <w:p>
@@ -6145,7 +6399,7 @@
           <w:b w:val="0"/>
           <w:sz w:val="21"/>
         </w:rPr>
-        <w:t xml:space="preserve">으로, 기록이 검색 대상이 되는 순간 기록 자체가 지수적으로 자기 증식할 수 있다. </w:t>
+        <w:t xml:space="preserve">으로, 기록이 검색 대상이 되는 순간 매 반복이 직전 기록을 재내장하며 기록 자체가 복리적으로 팽창할 수 있다. </w:t>
       </w:r>
       <w:r>
         <w:rPr>
@@ -6182,6 +6436,7 @@
     </w:p>
     <w:p>
       <w:pPr>
+        <w:keepNext/>
         <w:spacing w:before="200"/>
         <w:jc w:val="center"/>
       </w:pPr>
@@ -6297,13 +6552,14 @@
     </w:p>
     <w:p>
       <w:pPr>
+        <w:keepNext/>
         <w:spacing w:before="200"/>
         <w:jc w:val="center"/>
       </w:pPr>
       <w:r>
         <w:drawing>
           <wp:inline xmlns:a="http://schemas.openxmlformats.org/drawingml/2006/main" xmlns:pic="http://schemas.openxmlformats.org/drawingml/2006/picture">
-            <wp:extent cx="4032000" cy="432000"/>
+            <wp:extent cx="3168000" cy="2059200"/>
             <wp:docPr id="4" name="Picture 4"/>
             <wp:cNvGraphicFramePr>
               <a:graphicFrameLocks noChangeAspect="1"/>
@@ -6324,7 +6580,7 @@
                   <pic:spPr>
                     <a:xfrm>
                       <a:off x="0" y="0"/>
-                      <a:ext cx="4032000" cy="432000"/>
+                      <a:ext cx="3168000" cy="2059200"/>
                     </a:xfrm>
                     <a:prstGeom prst="rect"/>
                   </pic:spPr>
@@ -6418,7 +6674,23 @@
           <w:b w:val="0"/>
           <w:sz w:val="21"/>
         </w:rPr>
-        <w:t>본 절은 MAIOS의 인지 계층에 형식 온톨로지(RDFS/OWL)를 결합한 적용 연구를 보고한다. 결합 대상 온톨로지는 저자가 별도 연구에서 구축한 임무형지휘 온톨로지 스키마 v1(영문 식별자 + 한국어 rdfs:label, 지휘관 의도 5요소·개념 체계·정렬 관계를 포함하는 OWL-lite)이며, 모든 실증은 LLM 없이 오프라인으로 수행되었다.</w:t>
+        <w:t xml:space="preserve">본 절은 MAIOS의 인지 계층에 형식 온톨로지(RDFS/OWL)를 결합한 적용 연구를 보고한다. 결합 대상 온톨로지는 저자가 별도 연구에서 구축한 임무형지휘 온톨로지 스키마 v1(영문 식별자 + 한국어 rdfs:label, OWL-lite, 약 180트리플)에서 지휘관 의도 핵심부(의도 5요소와 그 정렬 관계)를 발췌한 66트리플 축약본이며, 모든 실증은 LLM 없이 오프라인으로 수행되었다. 전체 스키마가 아닌 발췌본을 사용한 이유는 스키마 v1에 동일 개념의 한국어 라벨 표기 변형("지휘관의도"/"지휘관 의도")이 중복 수록되어 있어, 공백 무시 정규화에 기반한 현 어댑터에서 라벨 충돌(섀도잉)이 발생하기 때문이다(한계는 7.5절에서 논한다). 재현용 발췌 온톨로지는 저장소의 </w:t>
+      </w:r>
+      <w:r>
+        <w:rPr>
+          <w:rFonts w:ascii="Consolas" w:hAnsi="Consolas" w:eastAsia="Consolas"/>
+          <w:b w:val="0"/>
+          <w:sz w:val="19"/>
+        </w:rPr>
+        <w:t>examples/mission_command_intent_core.ttl</w:t>
+      </w:r>
+      <w:r>
+        <w:rPr>
+          <w:rFonts w:ascii="바탕" w:hAnsi="바탕" w:eastAsia="바탕"/>
+          <w:b w:val="0"/>
+          <w:sz w:val="21"/>
+        </w:rPr>
+        <w:t>에 수록하였다.</w:t>
       </w:r>
     </w:p>
     <w:p>
@@ -6461,6 +6733,10 @@
         <w:gridCol w:w="2154"/>
       </w:tblGrid>
       <w:tr>
+        <w:trPr>
+          <w:cantSplit/>
+          <w:tblHeader/>
+        </w:trPr>
         <w:tc>
           <w:tcPr>
             <w:tcW w:type="dxa" w:w="2154"/>
@@ -6508,6 +6784,9 @@
         </w:tc>
       </w:tr>
       <w:tr>
+        <w:trPr>
+          <w:cantSplit/>
+        </w:trPr>
         <w:tc>
           <w:tcPr>
             <w:tcW w:type="dxa" w:w="2154"/>
@@ -6555,6 +6834,9 @@
         </w:tc>
       </w:tr>
       <w:tr>
+        <w:trPr>
+          <w:cantSplit/>
+        </w:trPr>
         <w:tc>
           <w:tcPr>
             <w:tcW w:type="dxa" w:w="2154"/>
@@ -6602,6 +6884,9 @@
         </w:tc>
       </w:tr>
       <w:tr>
+        <w:trPr>
+          <w:cantSplit/>
+        </w:trPr>
         <w:tc>
           <w:tcPr>
             <w:tcW w:type="dxa" w:w="2154"/>
@@ -6649,6 +6934,9 @@
         </w:tc>
       </w:tr>
       <w:tr>
+        <w:trPr>
+          <w:cantSplit/>
+        </w:trPr>
         <w:tc>
           <w:tcPr>
             <w:tcW w:type="dxa" w:w="2154"/>
@@ -6716,6 +7004,7 @@
     </w:p>
     <w:p>
       <w:pPr>
+        <w:keepNext/>
         <w:spacing w:before="200"/>
         <w:jc w:val="center"/>
       </w:pPr>
@@ -6799,6 +7088,7 @@
     </w:p>
     <w:p>
       <w:pPr>
+        <w:keepNext/>
         <w:spacing w:before="200"/>
         <w:jc w:val="center"/>
       </w:pPr>
@@ -6952,11 +7242,12 @@
           <w:b w:val="0"/>
           <w:sz w:val="21"/>
         </w:rPr>
-        <w:t xml:space="preserve"> — "모른다"를 모른다고 말하는 판정이며 인간 확인을 요구한다. CONFLICT는 거버넌스와 연동되어 자동으로 인간 승인 관문에 걸리고, 판정 전체가 수행 일지에 영속되어 사후 감사가 가능하다. 온톨로지는 판정의 어휘 폭을 넓힌다: 통제 실험에서 과업 "화력지원 태세 확립"에 대한 행동 "포병 사격 준비"는 표층 매칭으로는 CHECK였으나, 포병⊑화력지원 관계 결합 후 ALIGNED로 판정되었다.</w:t>
-      </w:r>
-    </w:p>
-    <w:p>
-      <w:pPr>
+        <w:t xml:space="preserve"> — "모른다"를 모른다고 말하는 판정이며 인간 확인을 요구한다. CONFLICT는 거버넌스와 연동되어 자동으로 인간 승인 관문에 걸리고, 판정 전체가 수행 일지에 영속되어 사후 감사가 가능하다. 온톨로지는 판정의 어휘 폭을 넓힌다: 포병⊑화력지원 관계를 담은 별도의 통제(합성) 온톨로지를 결합한 실험에서, 과업 "화력지원 태세 확립"에 대한 행동 "포병 사격 준비"는 표층 매칭으로는 CHECK였으나 관계 결합 후 ALIGNED로 판정되었다(해당 관계는 스키마 v1에 포함된 것이 아니라 이 실험을 위해 구성한 것이다).</w:t>
+      </w:r>
+    </w:p>
+    <w:p>
+      <w:pPr>
+        <w:keepNext/>
         <w:spacing w:before="200"/>
         <w:jc w:val="center"/>
       </w:pPr>
@@ -7035,7 +7326,7 @@
           <w:b w:val="0"/>
           <w:sz w:val="21"/>
         </w:rPr>
-        <w:t>세 접합의 총합은 임무형지휘 통제 양식의 소프트웨어적 번역이다: 의도의 구조적 공유(intent 명세) → 실행의 위임(자율 수행 루프) → 한계의 명시적 통제(거버넌스 상향 + 정렬 판정 + 인간 승인). 전 과정이 오프라인에서 동작하므로 폐쇄망 환경과 양립한다. 경계도 분명하다: 정렬 판정은 어휘·개념 매칭 기반의 1차 분류(triage)이지 의미론적 증명이 아니며, CHECK 판정률이 실무 유용성을 좌우한다. ABox의 자동 구축(J3)과 판정의 의미 수준 향상은 LLM 결합을 요구하는 향후 과제다.</w:t>
+        <w:t>세 접합의 총합은 임무형지휘 통제 양식의 소프트웨어적 번역이다: 의도의 구조적 공유(intent 명세) → 실행의 위임(자율 수행 루프) → 한계의 명시적 통제(거버넌스 상향 + 정렬 판정 + 인간 승인). 전 과정이 오프라인에서 동작하므로 폐쇄망 환경과 양립한다. 경계도 분명하다: 정렬 판정은 어휘·개념 매칭 기반의 1차 분류(triage)이지 의미론적 증명이 아니며, CHECK 판정률이 실무 유용성을 좌우한다. 또한 현 어댑터는 라벨 문자열을 열쇠로 삼으므로, 동일 개념의 라벨 표기 변형이 중복 수록된 온톨로지에서는 이웃 병합·섀도잉이 발생할 수 있다 — 실제로 스키마 v1 전체를 그대로 결합하면 7.2의 확장이 재현되지 않으며, 이것이 발췌본을 사용한 이유다. 라벨 정규화 규약 또는 IRI 기반 매칭, 그리고 ABox의 자동 구축(J3)과 판정의 의미 수준 향상은 향후 과제다.</w:t>
       </w:r>
     </w:p>
     <w:p>
@@ -7131,7 +7422,7 @@
           <w:b/>
           <w:sz w:val="21"/>
         </w:rPr>
-        <w:t>단일 사용자·단일 머신</w:t>
+        <w:t>단일 코퍼스 사례연구(N=1)</w:t>
       </w:r>
       <w:r>
         <w:rPr>
@@ -7139,7 +7430,7 @@
           <w:b w:val="0"/>
           <w:sz w:val="21"/>
         </w:rPr>
-        <w:t>: 워크스페이스는 동시 쓰기에 안전하지 않다.</w:t>
+        <w:t>: 6절의 실증은 단일 사용자·단일 코퍼스· 단일 실행의 사례연구다. 수치는 규모 등급 차이의 예시이며, 일반화에는 반복 측정과 이종 코퍼스 검증이 필요하다.</w:t>
       </w:r>
     </w:p>
     <w:p>
@@ -7161,7 +7452,7 @@
           <w:b/>
           <w:sz w:val="21"/>
         </w:rPr>
-        <w:t>정렬·거버넌스의 표층성</w:t>
+        <w:t>단일 사용자·단일 머신</w:t>
       </w:r>
       <w:r>
         <w:rPr>
@@ -7169,7 +7460,7 @@
           <w:b w:val="0"/>
           <w:sz w:val="21"/>
         </w:rPr>
-        <w:t>: 위험 분류와 의도 정렬 판정이 어휘·개념 매칭 기반의 1차 분류다(7.5절). 의미 수준 판정은 향후 과제다.</w:t>
+        <w:t>: 워크스페이스는 동시 쓰기에 안전하지 않다.</w:t>
       </w:r>
     </w:p>
     <w:p>
@@ -7191,6 +7482,36 @@
           <w:b/>
           <w:sz w:val="21"/>
         </w:rPr>
+        <w:t>정렬·거버넌스의 표층성</w:t>
+      </w:r>
+      <w:r>
+        <w:rPr>
+          <w:rFonts w:ascii="바탕" w:hAnsi="바탕" w:eastAsia="바탕"/>
+          <w:b w:val="0"/>
+          <w:sz w:val="21"/>
+        </w:rPr>
+        <w:t>: 위험 분류와 의도 정렬 판정이 어휘·개념 매칭 기반의 1차 분류다(7.5절). 의미 수준 판정은 향후 과제다.</w:t>
+      </w:r>
+    </w:p>
+    <w:p>
+      <w:pPr>
+        <w:spacing w:after="60" w:line="360" w:lineRule="auto"/>
+        <w:ind w:left="227"/>
+      </w:pPr>
+      <w:r>
+        <w:rPr>
+          <w:rFonts w:ascii="바탕" w:hAnsi="바탕" w:eastAsia="바탕"/>
+          <w:b w:val="0"/>
+          <w:sz w:val="21"/>
+        </w:rPr>
+        <w:t xml:space="preserve">• </w:t>
+      </w:r>
+      <w:r>
+        <w:rPr>
+          <w:rFonts w:ascii="바탕" w:hAnsi="바탕" w:eastAsia="바탕"/>
+          <w:b/>
+          <w:sz w:val="21"/>
+        </w:rPr>
         <w:t>용어의 수사적 위험</w:t>
       </w:r>
       <w:r>
@@ -7226,7 +7547,7 @@
           <w:b w:val="0"/>
           <w:sz w:val="21"/>
         </w:rPr>
-        <w:t>MAIOS는 휘발적 채팅을 넘어 기억·회상·거버넌스를 갖춘 임무 중심 AI 운용을 로컬 환경에서 구현했고, 실사용 코퍼스 실증으로 기억형 에이전트 특유의 규모 결함 세 가지를 식별·해소했다. 특히 자기 기록 되먹임 팽창은 수행 이력을 기억하는 모든 에이전트 설계가 점검해야 할 위험이라 판단한다. 나아가 형식 온톨로지를 회상·거버넌스·의도 정렬에 결합함으로써, 군사 지휘 이론이 정식화해 온 인간-부하 간 통제 양식(임무형지휘)이 인간-AI 통제 구조의 설계 언어로 이식될 수 있음을 작동 수준에서 보였다. 전 구현·이력은 공개 저장소에서 재현 가능하다.</w:t>
+        <w:t>MAIOS는 휘발적 채팅을 넘어 기억·회상·거버넌스를 갖춘 임무 중심 AI 운용을 로컬 환경에서 구현했고, 실사용 코퍼스 실증으로 기억형 에이전트 특유의 규모 결함 세 가지를 식별·해소했다. 특히 자기 기록 되먹임 팽창은 수행 이력을 기억하는 모든 에이전트 설계가 점검해야 할 위험이라 판단한다. 나아가 형식 온톨로지를 회상·거버넌스·의도 정렬에 결합함으로써, 군사 지휘 이론이 정식화해 온 인간-부하 간 통제 양식(임무형지휘)이 인간-AI 통제 구조의 설계 언어로 이식될 수 있음을 작동 수준에서 보였다. 전 구현은 공개 저장소에서 확인 가능하다.</w:t>
       </w:r>
     </w:p>
     <w:p>
@@ -7247,7 +7568,7 @@
           <w:b w:val="0"/>
           <w:sz w:val="21"/>
         </w:rPr>
-        <w:t>: https://github.com/yhkwon6454-boop/MAIOS (MIT, v1.3.0+, 테스트 506개, 커밋 이력에 본고의 전 실증 과정이 보존됨)</w:t>
+        <w:t>: https://github.com/yhkwon6454-boop/MAIOS (MIT, v1.3.0+, 테스트 506개). 코드 변경과 주요 수치의 요지는 커밋 이력에 기록되어 있으나, 6절의 실증 코퍼스는 사적 저술 자료로 공개되지 않으며 세부 측정값 일부는 개발 세션 기록에 근거한다.</w:t>
       </w:r>
     </w:p>
     <w:p>
@@ -7345,7 +7666,24 @@
           <w:b w:val="0"/>
           <w:sz w:val="21"/>
         </w:rPr>
-        <w:t>6. J. E. Laird, *The Soar Cognitive Architecture*, MIT Press, 2012.</w:t>
+        <w:t xml:space="preserve">6. J. E. Laird, </w:t>
+      </w:r>
+      <w:r>
+        <w:rPr>
+          <w:rFonts w:ascii="바탕" w:hAnsi="바탕" w:eastAsia="바탕"/>
+          <w:b w:val="0"/>
+          <w:i/>
+          <w:sz w:val="21"/>
+        </w:rPr>
+        <w:t>The Soar Cognitive Architecture</w:t>
+      </w:r>
+      <w:r>
+        <w:rPr>
+          <w:rFonts w:ascii="바탕" w:hAnsi="바탕" w:eastAsia="바탕"/>
+          <w:b w:val="0"/>
+          <w:sz w:val="21"/>
+        </w:rPr>
+        <w:t>, MIT Press, 2012.</w:t>
       </w:r>
     </w:p>
     <w:p>
@@ -7359,7 +7697,24 @@
           <w:b w:val="0"/>
           <w:sz w:val="21"/>
         </w:rPr>
-        <w:t>7. J. R. Anderson, *How Can the Human Mind Occur in the Physical Universe?*, Oxford University Press, 2007.</w:t>
+        <w:t xml:space="preserve">7. J. R. Anderson, </w:t>
+      </w:r>
+      <w:r>
+        <w:rPr>
+          <w:rFonts w:ascii="바탕" w:hAnsi="바탕" w:eastAsia="바탕"/>
+          <w:b w:val="0"/>
+          <w:i/>
+          <w:sz w:val="21"/>
+        </w:rPr>
+        <w:t>How Can the Human Mind Occur in the Physical Universe?</w:t>
+      </w:r>
+      <w:r>
+        <w:rPr>
+          <w:rFonts w:ascii="바탕" w:hAnsi="바탕" w:eastAsia="바탕"/>
+          <w:b w:val="0"/>
+          <w:sz w:val="21"/>
+        </w:rPr>
+        <w:t>, Oxford University Press, 2007.</w:t>
       </w:r>
     </w:p>
     <w:p>
@@ -7401,7 +7756,24 @@
           <w:b w:val="0"/>
           <w:sz w:val="21"/>
         </w:rPr>
-        <w:t>10. G. Salton and C. Buckley, "Term-Weighting Approaches in Automatic Text Retrieval," *Information Processing &amp; Management*, 24(5), 1988.</w:t>
+        <w:t xml:space="preserve">10. G. Salton and C. Buckley, "Term-Weighting Approaches in Automatic Text Retrieval," </w:t>
+      </w:r>
+      <w:r>
+        <w:rPr>
+          <w:rFonts w:ascii="바탕" w:hAnsi="바탕" w:eastAsia="바탕"/>
+          <w:b w:val="0"/>
+          <w:i/>
+          <w:sz w:val="21"/>
+        </w:rPr>
+        <w:t>Information Processing &amp; Management</w:t>
+      </w:r>
+      <w:r>
+        <w:rPr>
+          <w:rFonts w:ascii="바탕" w:hAnsi="바탕" w:eastAsia="바탕"/>
+          <w:b w:val="0"/>
+          <w:sz w:val="21"/>
+        </w:rPr>
+        <w:t>, 24(5), 1988.</w:t>
       </w:r>
     </w:p>
     <w:p>
@@ -7430,6 +7802,10 @@
         <w:gridCol w:w="3231"/>
       </w:tblGrid>
       <w:tr>
+        <w:trPr>
+          <w:cantSplit/>
+          <w:tblHeader/>
+        </w:trPr>
         <w:tc>
           <w:tcPr>
             <w:tcW w:type="dxa" w:w="3231"/>
@@ -7462,6 +7838,9 @@
         </w:tc>
       </w:tr>
       <w:tr>
+        <w:trPr>
+          <w:cantSplit/>
+        </w:trPr>
         <w:tc>
           <w:tcPr>
             <w:tcW w:type="dxa" w:w="3231"/>
@@ -7494,6 +7873,9 @@
         </w:tc>
       </w:tr>
       <w:tr>
+        <w:trPr>
+          <w:cantSplit/>
+        </w:trPr>
         <w:tc>
           <w:tcPr>
             <w:tcW w:type="dxa" w:w="3231"/>
@@ -7526,6 +7908,9 @@
         </w:tc>
       </w:tr>
       <w:tr>
+        <w:trPr>
+          <w:cantSplit/>
+        </w:trPr>
         <w:tc>
           <w:tcPr>
             <w:tcW w:type="dxa" w:w="3231"/>
@@ -7726,6 +8111,10 @@
         <w:gridCol w:w="2154"/>
       </w:tblGrid>
       <w:tr>
+        <w:trPr>
+          <w:cantSplit/>
+          <w:tblHeader/>
+        </w:trPr>
         <w:tc>
           <w:tcPr>
             <w:tcW w:type="dxa" w:w="2154"/>
@@ -7773,6 +8162,9 @@
         </w:tc>
       </w:tr>
       <w:tr>
+        <w:trPr>
+          <w:cantSplit/>
+        </w:trPr>
         <w:tc>
           <w:tcPr>
             <w:tcW w:type="dxa" w:w="2154"/>
@@ -7820,6 +8212,9 @@
         </w:tc>
       </w:tr>
       <w:tr>
+        <w:trPr>
+          <w:cantSplit/>
+        </w:trPr>
         <w:tc>
           <w:tcPr>
             <w:tcW w:type="dxa" w:w="2154"/>
@@ -7883,6 +8278,167 @@
         </w:tc>
       </w:tr>
       <w:tr>
+        <w:trPr>
+          <w:cantSplit/>
+        </w:trPr>
+        <w:tc>
+          <w:tcPr>
+            <w:tcW w:type="dxa" w:w="2154"/>
+          </w:tcPr>
+          <w:p>
+            <w:r>
+              <w:rPr>
+                <w:rFonts w:ascii="바탕" w:hAnsi="바탕" w:eastAsia="바탕"/>
+                <w:b/>
+                <w:sz w:val="18"/>
+              </w:rPr>
+              <w:t>docs\PAPER.ko.html</w:t>
+            </w:r>
+          </w:p>
+        </w:tc>
+        <w:tc>
+          <w:tcPr>
+            <w:tcW w:type="dxa" w:w="2154"/>
+          </w:tcPr>
+          <w:p>
+            <w:r>
+              <w:rPr>
+                <w:rFonts w:ascii="바탕" w:hAnsi="바탕" w:eastAsia="바탕"/>
+                <w:b w:val="0"/>
+                <w:sz w:val="18"/>
+              </w:rPr>
+              <w:t>논문 HTML 정본 — 전문 + 그림 7종(계층아키텍처·테스트성장·되먹임팽창 순환도·전후 스탯타일·접합부 J1~J4·의도간극 매개도·정렬판정 흐름도)</w:t>
+            </w:r>
+          </w:p>
+        </w:tc>
+        <w:tc>
+          <w:tcPr>
+            <w:tcW w:type="dxa" w:w="2154"/>
+          </w:tcPr>
+          <w:p>
+            <w:r>
+              <w:rPr>
+                <w:rFonts w:ascii="바탕" w:hAnsi="바탕" w:eastAsia="바탕"/>
+                <w:b w:val="0"/>
+                <w:sz w:val="18"/>
+              </w:rPr>
+              <w:t>1파일</w:t>
+            </w:r>
+          </w:p>
+        </w:tc>
+      </w:tr>
+      <w:tr>
+        <w:trPr>
+          <w:cantSplit/>
+        </w:trPr>
+        <w:tc>
+          <w:tcPr>
+            <w:tcW w:type="dxa" w:w="2154"/>
+          </w:tcPr>
+          <w:p>
+            <w:r>
+              <w:rPr>
+                <w:rFonts w:ascii="바탕" w:hAnsi="바탕" w:eastAsia="바탕"/>
+                <w:b/>
+                <w:sz w:val="18"/>
+              </w:rPr>
+              <w:t>docs\MAIOS_책_v1.docx</w:t>
+            </w:r>
+          </w:p>
+        </w:tc>
+        <w:tc>
+          <w:tcPr>
+            <w:tcW w:type="dxa" w:w="2154"/>
+          </w:tcPr>
+          <w:p>
+            <w:r>
+              <w:rPr>
+                <w:rFonts w:ascii="바탕" w:hAnsi="바탕" w:eastAsia="바탕"/>
+                <w:b w:val="0"/>
+                <w:sz w:val="18"/>
+              </w:rPr>
+              <w:t xml:space="preserve">책자판 (신국판 152×225) — 표지+머리말+차례+1부 매뉴얼+2부 논문(그림 삽입)+부록. 재빌드: </w:t>
+            </w:r>
+            <w:r>
+              <w:rPr>
+                <w:rFonts w:ascii="Consolas" w:hAnsi="Consolas" w:eastAsia="Consolas"/>
+                <w:b w:val="0"/>
+                <w:sz w:val="16"/>
+              </w:rPr>
+              <w:t>scripts\build_book.py</w:t>
+            </w:r>
+          </w:p>
+        </w:tc>
+        <w:tc>
+          <w:tcPr>
+            <w:tcW w:type="dxa" w:w="2154"/>
+          </w:tcPr>
+          <w:p>
+            <w:r>
+              <w:rPr>
+                <w:rFonts w:ascii="바탕" w:hAnsi="바탕" w:eastAsia="바탕"/>
+                <w:b w:val="0"/>
+                <w:sz w:val="18"/>
+              </w:rPr>
+              <w:t>40쪽</w:t>
+            </w:r>
+          </w:p>
+        </w:tc>
+      </w:tr>
+      <w:tr>
+        <w:trPr>
+          <w:cantSplit/>
+        </w:trPr>
+        <w:tc>
+          <w:tcPr>
+            <w:tcW w:type="dxa" w:w="2154"/>
+          </w:tcPr>
+          <w:p>
+            <w:r>
+              <w:rPr>
+                <w:rFonts w:ascii="바탕" w:hAnsi="바탕" w:eastAsia="바탕"/>
+                <w:b w:val="0"/>
+                <w:sz w:val="18"/>
+              </w:rPr>
+              <w:t>docs\figures\</w:t>
+            </w:r>
+          </w:p>
+        </w:tc>
+        <w:tc>
+          <w:tcPr>
+            <w:tcW w:type="dxa" w:w="2154"/>
+          </w:tcPr>
+          <w:p>
+            <w:r>
+              <w:rPr>
+                <w:rFonts w:ascii="바탕" w:hAnsi="바탕" w:eastAsia="바탕"/>
+                <w:b w:val="0"/>
+                <w:sz w:val="18"/>
+              </w:rPr>
+              <w:t>그림 7종 개별 파일 (fig1~fig7, html 원본 + png 렌더)</w:t>
+            </w:r>
+          </w:p>
+        </w:tc>
+        <w:tc>
+          <w:tcPr>
+            <w:tcW w:type="dxa" w:w="2154"/>
+          </w:tcPr>
+          <w:p>
+            <w:r>
+              <w:rPr>
+                <w:rFonts w:ascii="바탕" w:hAnsi="바탕" w:eastAsia="바탕"/>
+                <w:b w:val="0"/>
+                <w:sz w:val="18"/>
+              </w:rPr>
+              <w:t>14파일</w:t>
+            </w:r>
+          </w:p>
+        </w:tc>
+      </w:tr>
+      <w:tr>
+        <w:trPr>
+          <w:cantSplit/>
+        </w:trPr>
         <w:tc>
           <w:tcPr>
             <w:tcW w:type="dxa" w:w="2154"/>
@@ -7921,6 +8477,9 @@
         </w:tc>
       </w:tr>
       <w:tr>
+        <w:trPr>
+          <w:cantSplit/>
+        </w:trPr>
         <w:tc>
           <w:tcPr>
             <w:tcW w:type="dxa" w:w="2154"/>
@@ -7959,6 +8518,9 @@
         </w:tc>
       </w:tr>
       <w:tr>
+        <w:trPr>
+          <w:cantSplit/>
+        </w:trPr>
         <w:tc>
           <w:tcPr>
             <w:tcW w:type="dxa" w:w="2154"/>
@@ -8039,7 +8601,7 @@
           <w:rFonts w:ascii="Consolas" w:hAnsi="Consolas" w:eastAsia="Consolas"/>
           <w:b w:val="0"/>
           <w:color w:val="52514E"/>
-          <w:sz w:val="17"/>
+          <w:sz w:val="16"/>
         </w:rPr>
         <w:t>cd C:\Users\KYH\(연구)MAIOS</w:t>
       </w:r>
@@ -8054,7 +8616,7 @@
           <w:rFonts w:ascii="Consolas" w:hAnsi="Consolas" w:eastAsia="Consolas"/>
           <w:b w:val="0"/>
           <w:color w:val="52514E"/>
-          <w:sz w:val="17"/>
+          <w:sz w:val="16"/>
         </w:rPr>
         <w:t>.venv\Scripts\maios --version              # 1.3.0</w:t>
       </w:r>
@@ -8069,7 +8631,7 @@
           <w:rFonts w:ascii="Consolas" w:hAnsi="Consolas" w:eastAsia="Consolas"/>
           <w:b w:val="0"/>
           <w:color w:val="52514E"/>
-          <w:sz w:val="17"/>
+          <w:sz w:val="16"/>
         </w:rPr>
         <w:t>.venv\Scripts\maios introspect             # 자기 점검</w:t>
       </w:r>
@@ -8084,7 +8646,7 @@
           <w:rFonts w:ascii="Consolas" w:hAnsi="Consolas" w:eastAsia="Consolas"/>
           <w:b w:val="0"/>
           <w:color w:val="52514E"/>
-          <w:sz w:val="17"/>
+          <w:sz w:val="16"/>
         </w:rPr>
         <w:t>.venv\Scripts\maios shell                  # 대화형 세션</w:t>
       </w:r>
@@ -8099,7 +8661,7 @@
           <w:rFonts w:ascii="Consolas" w:hAnsi="Consolas" w:eastAsia="Consolas"/>
           <w:b w:val="0"/>
           <w:color w:val="52514E"/>
-          <w:sz w:val="17"/>
+          <w:sz w:val="16"/>
         </w:rPr>
         <w:t>.venv\Scripts\python scripts\validate_live.py --provider mock   # 전체 자가진단</w:t>
       </w:r>
@@ -8131,6 +8693,10 @@
         <w:gridCol w:w="2154"/>
       </w:tblGrid>
       <w:tr>
+        <w:trPr>
+          <w:cantSplit/>
+          <w:tblHeader/>
+        </w:trPr>
         <w:tc>
           <w:tcPr>
             <w:tcW w:type="dxa" w:w="2154"/>
@@ -8178,6 +8744,9 @@
         </w:tc>
       </w:tr>
       <w:tr>
+        <w:trPr>
+          <w:cantSplit/>
+        </w:trPr>
         <w:tc>
           <w:tcPr>
             <w:tcW w:type="dxa" w:w="2154"/>
@@ -8225,6 +8794,9 @@
         </w:tc>
       </w:tr>
       <w:tr>
+        <w:trPr>
+          <w:cantSplit/>
+        </w:trPr>
         <w:tc>
           <w:tcPr>
             <w:tcW w:type="dxa" w:w="2154"/>
@@ -8272,6 +8844,9 @@
         </w:tc>
       </w:tr>
       <w:tr>
+        <w:trPr>
+          <w:cantSplit/>
+        </w:trPr>
         <w:tc>
           <w:tcPr>
             <w:tcW w:type="dxa" w:w="2154"/>
@@ -8319,6 +8894,9 @@
         </w:tc>
       </w:tr>
       <w:tr>
+        <w:trPr>
+          <w:cantSplit/>
+        </w:trPr>
         <w:tc>
           <w:tcPr>
             <w:tcW w:type="dxa" w:w="2154"/>
@@ -8366,6 +8944,9 @@
         </w:tc>
       </w:tr>
       <w:tr>
+        <w:trPr>
+          <w:cantSplit/>
+        </w:trPr>
         <w:tc>
           <w:tcPr>
             <w:tcW w:type="dxa" w:w="2154"/>
@@ -8413,6 +8994,9 @@
         </w:tc>
       </w:tr>
       <w:tr>
+        <w:trPr>
+          <w:cantSplit/>
+        </w:trPr>
         <w:tc>
           <w:tcPr>
             <w:tcW w:type="dxa" w:w="2154"/>
@@ -8460,6 +9044,9 @@
         </w:tc>
       </w:tr>
       <w:tr>
+        <w:trPr>
+          <w:cantSplit/>
+        </w:trPr>
         <w:tc>
           <w:tcPr>
             <w:tcW w:type="dxa" w:w="2154"/>
@@ -8507,6 +9094,9 @@
         </w:tc>
       </w:tr>
       <w:tr>
+        <w:trPr>
+          <w:cantSplit/>
+        </w:trPr>
         <w:tc>
           <w:tcPr>
             <w:tcW w:type="dxa" w:w="2154"/>
@@ -8554,6 +9144,9 @@
         </w:tc>
       </w:tr>
       <w:tr>
+        <w:trPr>
+          <w:cantSplit/>
+        </w:trPr>
         <w:tc>
           <w:tcPr>
             <w:tcW w:type="dxa" w:w="2154"/>
@@ -8601,6 +9194,9 @@
         </w:tc>
       </w:tr>
       <w:tr>
+        <w:trPr>
+          <w:cantSplit/>
+        </w:trPr>
         <w:tc>
           <w:tcPr>
             <w:tcW w:type="dxa" w:w="2154"/>
@@ -8648,6 +9244,9 @@
         </w:tc>
       </w:tr>
       <w:tr>
+        <w:trPr>
+          <w:cantSplit/>
+        </w:trPr>
         <w:tc>
           <w:tcPr>
             <w:tcW w:type="dxa" w:w="2154"/>
@@ -8695,6 +9294,9 @@
         </w:tc>
       </w:tr>
       <w:tr>
+        <w:trPr>
+          <w:cantSplit/>
+        </w:trPr>
         <w:tc>
           <w:tcPr>
             <w:tcW w:type="dxa" w:w="2154"/>
@@ -8742,6 +9344,9 @@
         </w:tc>
       </w:tr>
       <w:tr>
+        <w:trPr>
+          <w:cantSplit/>
+        </w:trPr>
         <w:tc>
           <w:tcPr>
             <w:tcW w:type="dxa" w:w="2154"/>
@@ -8789,6 +9394,9 @@
         </w:tc>
       </w:tr>
       <w:tr>
+        <w:trPr>
+          <w:cantSplit/>
+        </w:trPr>
         <w:tc>
           <w:tcPr>
             <w:tcW w:type="dxa" w:w="2154"/>
@@ -8836,6 +9444,9 @@
         </w:tc>
       </w:tr>
       <w:tr>
+        <w:trPr>
+          <w:cantSplit/>
+        </w:trPr>
         <w:tc>
           <w:tcPr>
             <w:tcW w:type="dxa" w:w="2154"/>
@@ -8883,6 +9494,9 @@
         </w:tc>
       </w:tr>
       <w:tr>
+        <w:trPr>
+          <w:cantSplit/>
+        </w:trPr>
         <w:tc>
           <w:tcPr>
             <w:tcW w:type="dxa" w:w="2154"/>
@@ -8930,6 +9544,9 @@
         </w:tc>
       </w:tr>
       <w:tr>
+        <w:trPr>
+          <w:cantSplit/>
+        </w:trPr>
         <w:tc>
           <w:tcPr>
             <w:tcW w:type="dxa" w:w="2154"/>
@@ -8977,6 +9594,9 @@
         </w:tc>
       </w:tr>
       <w:tr>
+        <w:trPr>
+          <w:cantSplit/>
+        </w:trPr>
         <w:tc>
           <w:tcPr>
             <w:tcW w:type="dxa" w:w="2154"/>
@@ -9024,6 +9644,9 @@
         </w:tc>
       </w:tr>
       <w:tr>
+        <w:trPr>
+          <w:cantSplit/>
+        </w:trPr>
         <w:tc>
           <w:tcPr>
             <w:tcW w:type="dxa" w:w="2154"/>
@@ -9071,6 +9694,9 @@
         </w:tc>
       </w:tr>
       <w:tr>
+        <w:trPr>
+          <w:cantSplit/>
+        </w:trPr>
         <w:tc>
           <w:tcPr>
             <w:tcW w:type="dxa" w:w="2154"/>
@@ -9118,6 +9744,9 @@
         </w:tc>
       </w:tr>
       <w:tr>
+        <w:trPr>
+          <w:cantSplit/>
+        </w:trPr>
         <w:tc>
           <w:tcPr>
             <w:tcW w:type="dxa" w:w="2154"/>
@@ -9165,6 +9794,9 @@
         </w:tc>
       </w:tr>
       <w:tr>
+        <w:trPr>
+          <w:cantSplit/>
+        </w:trPr>
         <w:tc>
           <w:tcPr>
             <w:tcW w:type="dxa" w:w="2154"/>
@@ -9212,6 +9844,9 @@
         </w:tc>
       </w:tr>
       <w:tr>
+        <w:trPr>
+          <w:cantSplit/>
+        </w:trPr>
         <w:tc>
           <w:tcPr>
             <w:tcW w:type="dxa" w:w="2154"/>
@@ -9371,6 +10006,10 @@
         <w:gridCol w:w="2154"/>
       </w:tblGrid>
       <w:tr>
+        <w:trPr>
+          <w:cantSplit/>
+          <w:tblHeader/>
+        </w:trPr>
         <w:tc>
           <w:tcPr>
             <w:tcW w:type="dxa" w:w="2154"/>
@@ -9418,6 +10057,9 @@
         </w:tc>
       </w:tr>
       <w:tr>
+        <w:trPr>
+          <w:cantSplit/>
+        </w:trPr>
         <w:tc>
           <w:tcPr>
             <w:tcW w:type="dxa" w:w="2154"/>
@@ -9473,6 +10115,9 @@
         </w:tc>
       </w:tr>
       <w:tr>
+        <w:trPr>
+          <w:cantSplit/>
+        </w:trPr>
         <w:tc>
           <w:tcPr>
             <w:tcW w:type="dxa" w:w="2154"/>
@@ -9528,6 +10173,9 @@
         </w:tc>
       </w:tr>
       <w:tr>
+        <w:trPr>
+          <w:cantSplit/>
+        </w:trPr>
         <w:tc>
           <w:tcPr>
             <w:tcW w:type="dxa" w:w="2154"/>
@@ -9591,6 +10239,9 @@
         </w:tc>
       </w:tr>
       <w:tr>
+        <w:trPr>
+          <w:cantSplit/>
+        </w:trPr>
         <w:tc>
           <w:tcPr>
             <w:tcW w:type="dxa" w:w="2154"/>

</xml_diff>